<commit_message>
Updated script to use version string; updated design spec to reflect all the 2.X changes.
</commit_message>
<xml_diff>
--- a/docs/GlobalGlueUpSync_Design_Spec.docx
+++ b/docs/GlobalGlueUpSync_Design_Spec.docx
@@ -18441,19 +18441,6 @@
         <w:spacing w:after="80"/>
       </w:pPr>
       <w:r>
-        <w:t>glueup_token.json in working directory (generated by GetToken.py)</w:t>
-      </w:r>
-    </w:p>
-    <w:p>
-      <w:pPr>
-        <w:pStyle w:val="ListParagraph"/>
-        <w:numPr>
-          <w:ilvl w:val="0"/>
-          <w:numId w:val="2"/>
-        </w:numPr>
-        <w:spacing w:after="80"/>
-      </w:pPr>
-      <w:r>
         <w:t>ZipCodes_Areas_CCC.xlsx in working directory (for Local Region lookup)</w:t>
       </w:r>
     </w:p>
@@ -18463,7 +18450,6 @@
         <w:pStyle w:val="Heading2"/>
       </w:pPr>
       <w:r>
-        <w:lastRenderedPageBreak/>
         <w:t>8.2 Command Syntax</w:t>
       </w:r>
     </w:p>
@@ -18517,6 +18503,7 @@
                 <w:sz w:val="18"/>
                 <w:szCs w:val="18"/>
               </w:rPr>
+              <w:lastRenderedPageBreak/>
               <w:t>Command</w:t>
             </w:r>
           </w:p>
@@ -18844,6 +18831,11 @@
     <w:p>
       <w:pPr>
         <w:spacing w:after="120"/>
+        <w:rPr>
+          <w:rFonts w:ascii="Courier New" w:eastAsia="Courier New" w:hAnsi="Courier New" w:cs="Courier New"/>
+          <w:sz w:val="18"/>
+          <w:szCs w:val="18"/>
+        </w:rPr>
       </w:pPr>
       <w:r>
         <w:t>The console and run log show the following summary after every run:</w:t>
@@ -18855,11 +18847,49 @@
       </w:pPr>
       <w:r>
         <w:rPr>
-          <w:rFonts w:ascii="Courier New" w:eastAsia="Courier New" w:hAnsi="Courier New" w:cs="Courier New"/>
-          <w:sz w:val="18"/>
-          <w:szCs w:val="18"/>
+          <w:noProof/>
         </w:rPr>
-        <w:t>── Run Summary ─────────────────────────────────────────────────────   Total rows read:                    848   Skipped (no data):                    0   New members:                          4   Renewals (manual):                   17   Changed (other fields):              36   Same (no change):                   791   Dropped from ICF Global:              6   Contact rows to import:              57   Membership rows to import:            4   Renewal rows (manual):               17 ─────────────────────────────────────────────────────────────</w:t>
+        <w:drawing>
+          <wp:inline distT="0" distB="0" distL="0" distR="0" wp14:anchorId="2CF9AC7D" wp14:editId="17412D57">
+            <wp:extent cx="4240106" cy="1597611"/>
+            <wp:effectExtent l="0" t="0" r="1905" b="3175"/>
+            <wp:docPr id="774410342" name="Picture 1"/>
+            <wp:cNvGraphicFramePr>
+              <a:graphicFrameLocks xmlns:a="http://schemas.openxmlformats.org/drawingml/2006/main" noChangeAspect="1"/>
+            </wp:cNvGraphicFramePr>
+            <a:graphic xmlns:a="http://schemas.openxmlformats.org/drawingml/2006/main">
+              <a:graphicData uri="http://schemas.openxmlformats.org/drawingml/2006/picture">
+                <pic:pic xmlns:pic="http://schemas.openxmlformats.org/drawingml/2006/picture">
+                  <pic:nvPicPr>
+                    <pic:cNvPr id="774410342" name="Picture 774410342"/>
+                    <pic:cNvPicPr/>
+                  </pic:nvPicPr>
+                  <pic:blipFill>
+                    <a:blip r:embed="rId7">
+                      <a:extLst>
+                        <a:ext uri="{28A0092B-C50C-407E-A947-70E740481C1C}">
+                          <a14:useLocalDpi xmlns:a14="http://schemas.microsoft.com/office/drawing/2010/main" val="0"/>
+                        </a:ext>
+                      </a:extLst>
+                    </a:blip>
+                    <a:stretch>
+                      <a:fillRect/>
+                    </a:stretch>
+                  </pic:blipFill>
+                  <pic:spPr>
+                    <a:xfrm>
+                      <a:off x="0" y="0"/>
+                      <a:ext cx="4315211" cy="1625909"/>
+                    </a:xfrm>
+                    <a:prstGeom prst="rect">
+                      <a:avLst/>
+                    </a:prstGeom>
+                  </pic:spPr>
+                </pic:pic>
+              </a:graphicData>
+            </a:graphic>
+          </wp:inline>
+        </w:drawing>
       </w:r>
     </w:p>
     <w:p>
@@ -19435,7 +19465,7 @@
         </w:trPr>
         <w:tc>
           <w:tcPr>
-            <w:tcW w:w="350" w:type="dxa"/>
+            <w:tcW w:w="441" w:type="dxa"/>
             <w:tcBorders>
               <w:top w:val="single" w:sz="1" w:space="0" w:color="CCCCCC"/>
               <w:left w:val="single" w:sz="1" w:space="0" w:color="CCCCCC"/>
@@ -19464,7 +19494,7 @@
         </w:tc>
         <w:tc>
           <w:tcPr>
-            <w:tcW w:w="4000" w:type="dxa"/>
+            <w:tcW w:w="3990" w:type="dxa"/>
             <w:tcBorders>
               <w:top w:val="single" w:sz="1" w:space="0" w:color="CCCCCC"/>
               <w:left w:val="single" w:sz="1" w:space="0" w:color="CCCCCC"/>
@@ -19493,7 +19523,7 @@
         </w:tc>
         <w:tc>
           <w:tcPr>
-            <w:tcW w:w="1800" w:type="dxa"/>
+            <w:tcW w:w="1780" w:type="dxa"/>
             <w:tcBorders>
               <w:top w:val="single" w:sz="1" w:space="0" w:color="CCCCCC"/>
               <w:left w:val="single" w:sz="1" w:space="0" w:color="CCCCCC"/>
@@ -19522,7 +19552,7 @@
         </w:tc>
         <w:tc>
           <w:tcPr>
-            <w:tcW w:w="3210" w:type="dxa"/>
+            <w:tcW w:w="3149" w:type="dxa"/>
             <w:tcBorders>
               <w:top w:val="single" w:sz="1" w:space="0" w:color="CCCCCC"/>
               <w:left w:val="single" w:sz="1" w:space="0" w:color="CCCCCC"/>
@@ -19553,7 +19583,7 @@
       <w:tr>
         <w:tc>
           <w:tcPr>
-            <w:tcW w:w="350" w:type="dxa"/>
+            <w:tcW w:w="441" w:type="dxa"/>
             <w:tcBorders>
               <w:top w:val="single" w:sz="1" w:space="0" w:color="CCCCCC"/>
               <w:left w:val="single" w:sz="1" w:space="0" w:color="CCCCCC"/>
@@ -19580,7 +19610,7 @@
         </w:tc>
         <w:tc>
           <w:tcPr>
-            <w:tcW w:w="4000" w:type="dxa"/>
+            <w:tcW w:w="3990" w:type="dxa"/>
             <w:tcBorders>
               <w:top w:val="single" w:sz="1" w:space="0" w:color="CCCCCC"/>
               <w:left w:val="single" w:sz="1" w:space="0" w:color="CCCCCC"/>
@@ -19607,7 +19637,7 @@
         </w:tc>
         <w:tc>
           <w:tcPr>
-            <w:tcW w:w="1800" w:type="dxa"/>
+            <w:tcW w:w="1780" w:type="dxa"/>
             <w:tcBorders>
               <w:top w:val="single" w:sz="1" w:space="0" w:color="CCCCCC"/>
               <w:left w:val="single" w:sz="1" w:space="0" w:color="CCCCCC"/>
@@ -19634,7 +19664,7 @@
         </w:tc>
         <w:tc>
           <w:tcPr>
-            <w:tcW w:w="3210" w:type="dxa"/>
+            <w:tcW w:w="3149" w:type="dxa"/>
             <w:tcBorders>
               <w:top w:val="single" w:sz="1" w:space="0" w:color="CCCCCC"/>
               <w:left w:val="single" w:sz="1" w:space="0" w:color="CCCCCC"/>
@@ -19663,7 +19693,7 @@
       <w:tr>
         <w:tc>
           <w:tcPr>
-            <w:tcW w:w="350" w:type="dxa"/>
+            <w:tcW w:w="441" w:type="dxa"/>
             <w:tcBorders>
               <w:top w:val="single" w:sz="1" w:space="0" w:color="CCCCCC"/>
               <w:left w:val="single" w:sz="1" w:space="0" w:color="CCCCCC"/>
@@ -19690,7 +19720,7 @@
         </w:tc>
         <w:tc>
           <w:tcPr>
-            <w:tcW w:w="4000" w:type="dxa"/>
+            <w:tcW w:w="3990" w:type="dxa"/>
             <w:tcBorders>
               <w:top w:val="single" w:sz="1" w:space="0" w:color="CCCCCC"/>
               <w:left w:val="single" w:sz="1" w:space="0" w:color="CCCCCC"/>
@@ -19717,7 +19747,7 @@
         </w:tc>
         <w:tc>
           <w:tcPr>
-            <w:tcW w:w="1800" w:type="dxa"/>
+            <w:tcW w:w="1780" w:type="dxa"/>
             <w:tcBorders>
               <w:top w:val="single" w:sz="1" w:space="0" w:color="CCCCCC"/>
               <w:left w:val="single" w:sz="1" w:space="0" w:color="CCCCCC"/>
@@ -19744,7 +19774,7 @@
         </w:tc>
         <w:tc>
           <w:tcPr>
-            <w:tcW w:w="3210" w:type="dxa"/>
+            <w:tcW w:w="3149" w:type="dxa"/>
             <w:tcBorders>
               <w:top w:val="single" w:sz="1" w:space="0" w:color="CCCCCC"/>
               <w:left w:val="single" w:sz="1" w:space="0" w:color="CCCCCC"/>
@@ -19775,61 +19805,61 @@
       <w:tr>
         <w:tc>
           <w:tcPr>
-            <w:tcW w:w="350" w:type="dxa"/>
-            <w:tcBorders>
-              <w:top w:val="single" w:sz="1" w:space="0" w:color="CCCCCC"/>
-              <w:left w:val="single" w:sz="1" w:space="0" w:color="CCCCCC"/>
-              <w:bottom w:val="single" w:sz="1" w:space="0" w:color="CCCCCC"/>
-              <w:right w:val="single" w:sz="1" w:space="0" w:color="CCCCCC"/>
-            </w:tcBorders>
-            <w:shd w:val="clear" w:color="auto" w:fill="FFFFFF"/>
-            <w:tcMar>
-              <w:top w:w="80" w:type="dxa"/>
-              <w:left w:w="120" w:type="dxa"/>
-              <w:bottom w:w="80" w:type="dxa"/>
-              <w:right w:w="120" w:type="dxa"/>
-            </w:tcMar>
-          </w:tcPr>
-          <w:p>
-            <w:r>
-              <w:rPr>
-                <w:sz w:val="18"/>
-                <w:szCs w:val="18"/>
-              </w:rPr>
-              <w:t>7</w:t>
-            </w:r>
-          </w:p>
-        </w:tc>
-        <w:tc>
-          <w:tcPr>
-            <w:tcW w:w="4000" w:type="dxa"/>
-            <w:tcBorders>
-              <w:top w:val="single" w:sz="1" w:space="0" w:color="CCCCCC"/>
-              <w:left w:val="single" w:sz="1" w:space="0" w:color="CCCCCC"/>
-              <w:bottom w:val="single" w:sz="1" w:space="0" w:color="CCCCCC"/>
-              <w:right w:val="single" w:sz="1" w:space="0" w:color="CCCCCC"/>
-            </w:tcBorders>
-            <w:shd w:val="clear" w:color="auto" w:fill="FFFFFF"/>
-            <w:tcMar>
-              <w:top w:w="80" w:type="dxa"/>
-              <w:left w:w="120" w:type="dxa"/>
-              <w:bottom w:w="80" w:type="dxa"/>
-              <w:right w:w="120" w:type="dxa"/>
-            </w:tcMar>
-          </w:tcPr>
-          <w:p>
-            <w:r>
-              <w:rPr>
-                <w:sz w:val="18"/>
-                <w:szCs w:val="18"/>
-              </w:rPr>
-              <w:t>Member_Type column: add to the Make Get Active Members scenario output (Col W).</w:t>
-            </w:r>
-          </w:p>
-        </w:tc>
-        <w:tc>
-          <w:tcPr>
-            <w:tcW w:w="1800" w:type="dxa"/>
+            <w:tcW w:w="441" w:type="dxa"/>
+            <w:tcBorders>
+              <w:top w:val="single" w:sz="1" w:space="0" w:color="CCCCCC"/>
+              <w:left w:val="single" w:sz="1" w:space="0" w:color="CCCCCC"/>
+              <w:bottom w:val="single" w:sz="1" w:space="0" w:color="CCCCCC"/>
+              <w:right w:val="single" w:sz="1" w:space="0" w:color="CCCCCC"/>
+            </w:tcBorders>
+            <w:shd w:val="clear" w:color="auto" w:fill="FFFFFF"/>
+            <w:tcMar>
+              <w:top w:w="80" w:type="dxa"/>
+              <w:left w:w="120" w:type="dxa"/>
+              <w:bottom w:w="80" w:type="dxa"/>
+              <w:right w:w="120" w:type="dxa"/>
+            </w:tcMar>
+          </w:tcPr>
+          <w:p>
+            <w:r>
+              <w:rPr>
+                <w:sz w:val="18"/>
+                <w:szCs w:val="18"/>
+              </w:rPr>
+              <w:t>9</w:t>
+            </w:r>
+          </w:p>
+        </w:tc>
+        <w:tc>
+          <w:tcPr>
+            <w:tcW w:w="3990" w:type="dxa"/>
+            <w:tcBorders>
+              <w:top w:val="single" w:sz="1" w:space="0" w:color="CCCCCC"/>
+              <w:left w:val="single" w:sz="1" w:space="0" w:color="CCCCCC"/>
+              <w:bottom w:val="single" w:sz="1" w:space="0" w:color="CCCCCC"/>
+              <w:right w:val="single" w:sz="1" w:space="0" w:color="CCCCCC"/>
+            </w:tcBorders>
+            <w:shd w:val="clear" w:color="auto" w:fill="FFFFFF"/>
+            <w:tcMar>
+              <w:top w:w="80" w:type="dxa"/>
+              <w:left w:w="120" w:type="dxa"/>
+              <w:bottom w:w="80" w:type="dxa"/>
+              <w:right w:w="120" w:type="dxa"/>
+            </w:tcMar>
+          </w:tcPr>
+          <w:p>
+            <w:r>
+              <w:rPr>
+                <w:sz w:val="18"/>
+                <w:szCs w:val="18"/>
+              </w:rPr>
+              <w:t>International address formats: Make scenario may produce column-shifted rows for non-US/CA addresses (confirmed for Estonia). Fix in Make Module 5 column mappings.</w:t>
+            </w:r>
+          </w:p>
+        </w:tc>
+        <w:tc>
+          <w:tcPr>
+            <w:tcW w:w="1780" w:type="dxa"/>
             <w:tcBorders>
               <w:top w:val="single" w:sz="1" w:space="0" w:color="CCCCCC"/>
               <w:left w:val="single" w:sz="1" w:space="0" w:color="CCCCCC"/>
@@ -19856,28 +19886,28 @@
         </w:tc>
         <w:tc>
           <w:tcPr>
-            <w:tcW w:w="3210" w:type="dxa"/>
-            <w:tcBorders>
-              <w:top w:val="single" w:sz="1" w:space="0" w:color="CCCCCC"/>
-              <w:left w:val="single" w:sz="1" w:space="0" w:color="CCCCCC"/>
-              <w:bottom w:val="single" w:sz="1" w:space="0" w:color="CCCCCC"/>
-              <w:right w:val="single" w:sz="1" w:space="0" w:color="CCCCCC"/>
-            </w:tcBorders>
-            <w:shd w:val="clear" w:color="auto" w:fill="FFFFFF"/>
-            <w:tcMar>
-              <w:top w:w="80" w:type="dxa"/>
-              <w:left w:w="120" w:type="dxa"/>
-              <w:bottom w:w="80" w:type="dxa"/>
-              <w:right w:w="120" w:type="dxa"/>
-            </w:tcMar>
-          </w:tcPr>
-          <w:p>
-            <w:r>
-              <w:rPr>
-                <w:sz w:val="18"/>
-                <w:szCs w:val="18"/>
-              </w:rPr>
-              <w:t>Open — field defaults to blank if absent</w:t>
+            <w:tcW w:w="3149" w:type="dxa"/>
+            <w:tcBorders>
+              <w:top w:val="single" w:sz="1" w:space="0" w:color="CCCCCC"/>
+              <w:left w:val="single" w:sz="1" w:space="0" w:color="CCCCCC"/>
+              <w:bottom w:val="single" w:sz="1" w:space="0" w:color="CCCCCC"/>
+              <w:right w:val="single" w:sz="1" w:space="0" w:color="CCCCCC"/>
+            </w:tcBorders>
+            <w:shd w:val="clear" w:color="auto" w:fill="FFFFFF"/>
+            <w:tcMar>
+              <w:top w:w="80" w:type="dxa"/>
+              <w:left w:w="120" w:type="dxa"/>
+              <w:bottom w:w="80" w:type="dxa"/>
+              <w:right w:w="120" w:type="dxa"/>
+            </w:tcMar>
+          </w:tcPr>
+          <w:p>
+            <w:r>
+              <w:rPr>
+                <w:sz w:val="18"/>
+                <w:szCs w:val="18"/>
+              </w:rPr>
+              <w:t>Open — validation catches and hard-skips affected rows</w:t>
             </w:r>
           </w:p>
         </w:tc>
@@ -19885,227 +19915,7 @@
       <w:tr>
         <w:tc>
           <w:tcPr>
-            <w:tcW w:w="350" w:type="dxa"/>
-            <w:tcBorders>
-              <w:top w:val="single" w:sz="1" w:space="0" w:color="CCCCCC"/>
-              <w:left w:val="single" w:sz="1" w:space="0" w:color="CCCCCC"/>
-              <w:bottom w:val="single" w:sz="1" w:space="0" w:color="CCCCCC"/>
-              <w:right w:val="single" w:sz="1" w:space="0" w:color="CCCCCC"/>
-            </w:tcBorders>
-            <w:shd w:val="clear" w:color="auto" w:fill="FFFFFF"/>
-            <w:tcMar>
-              <w:top w:w="80" w:type="dxa"/>
-              <w:left w:w="120" w:type="dxa"/>
-              <w:bottom w:w="80" w:type="dxa"/>
-              <w:right w:w="120" w:type="dxa"/>
-            </w:tcMar>
-          </w:tcPr>
-          <w:p>
-            <w:r>
-              <w:rPr>
-                <w:sz w:val="18"/>
-                <w:szCs w:val="18"/>
-              </w:rPr>
-              <w:t>8</w:t>
-            </w:r>
-          </w:p>
-        </w:tc>
-        <w:tc>
-          <w:tcPr>
-            <w:tcW w:w="4000" w:type="dxa"/>
-            <w:tcBorders>
-              <w:top w:val="single" w:sz="1" w:space="0" w:color="CCCCCC"/>
-              <w:left w:val="single" w:sz="1" w:space="0" w:color="CCCCCC"/>
-              <w:bottom w:val="single" w:sz="1" w:space="0" w:color="CCCCCC"/>
-              <w:right w:val="single" w:sz="1" w:space="0" w:color="CCCCCC"/>
-            </w:tcBorders>
-            <w:shd w:val="clear" w:color="auto" w:fill="FFFFFF"/>
-            <w:tcMar>
-              <w:top w:w="80" w:type="dxa"/>
-              <w:left w:w="120" w:type="dxa"/>
-              <w:bottom w:w="80" w:type="dxa"/>
-              <w:right w:w="120" w:type="dxa"/>
-            </w:tcMar>
-          </w:tcPr>
-          <w:p>
-            <w:r>
-              <w:rPr>
-                <w:sz w:val="18"/>
-                <w:szCs w:val="18"/>
-              </w:rPr>
-              <w:t>Grace-period members: GlueUp API does not return members in the 90-day grace period. These will always appear as NEW. No API workaround available.</w:t>
-            </w:r>
-          </w:p>
-        </w:tc>
-        <w:tc>
-          <w:tcPr>
-            <w:tcW w:w="1800" w:type="dxa"/>
-            <w:tcBorders>
-              <w:top w:val="single" w:sz="1" w:space="0" w:color="CCCCCC"/>
-              <w:left w:val="single" w:sz="1" w:space="0" w:color="CCCCCC"/>
-              <w:bottom w:val="single" w:sz="1" w:space="0" w:color="CCCCCC"/>
-              <w:right w:val="single" w:sz="1" w:space="0" w:color="CCCCCC"/>
-            </w:tcBorders>
-            <w:shd w:val="clear" w:color="auto" w:fill="FFFFFF"/>
-            <w:tcMar>
-              <w:top w:w="80" w:type="dxa"/>
-              <w:left w:w="120" w:type="dxa"/>
-              <w:bottom w:w="80" w:type="dxa"/>
-              <w:right w:w="120" w:type="dxa"/>
-            </w:tcMar>
-          </w:tcPr>
-          <w:p>
-            <w:r>
-              <w:rPr>
-                <w:sz w:val="18"/>
-                <w:szCs w:val="18"/>
-              </w:rPr>
-              <w:t>GlueUp Platform</w:t>
-            </w:r>
-          </w:p>
-        </w:tc>
-        <w:tc>
-          <w:tcPr>
-            <w:tcW w:w="3210" w:type="dxa"/>
-            <w:tcBorders>
-              <w:top w:val="single" w:sz="1" w:space="0" w:color="CCCCCC"/>
-              <w:left w:val="single" w:sz="1" w:space="0" w:color="CCCCCC"/>
-              <w:bottom w:val="single" w:sz="1" w:space="0" w:color="CCCCCC"/>
-              <w:right w:val="single" w:sz="1" w:space="0" w:color="CCCCCC"/>
-            </w:tcBorders>
-            <w:shd w:val="clear" w:color="auto" w:fill="FFFFFF"/>
-            <w:tcMar>
-              <w:top w:w="80" w:type="dxa"/>
-              <w:left w:w="120" w:type="dxa"/>
-              <w:bottom w:w="80" w:type="dxa"/>
-              <w:right w:w="120" w:type="dxa"/>
-            </w:tcMar>
-          </w:tcPr>
-          <w:p>
-            <w:r>
-              <w:rPr>
-                <w:sz w:val="18"/>
-                <w:szCs w:val="18"/>
-              </w:rPr>
-              <w:t>Open — known limitation, no fix available</w:t>
-            </w:r>
-          </w:p>
-        </w:tc>
-      </w:tr>
-      <w:tr>
-        <w:tc>
-          <w:tcPr>
-            <w:tcW w:w="350" w:type="dxa"/>
-            <w:tcBorders>
-              <w:top w:val="single" w:sz="1" w:space="0" w:color="CCCCCC"/>
-              <w:left w:val="single" w:sz="1" w:space="0" w:color="CCCCCC"/>
-              <w:bottom w:val="single" w:sz="1" w:space="0" w:color="CCCCCC"/>
-              <w:right w:val="single" w:sz="1" w:space="0" w:color="CCCCCC"/>
-            </w:tcBorders>
-            <w:shd w:val="clear" w:color="auto" w:fill="FFFFFF"/>
-            <w:tcMar>
-              <w:top w:w="80" w:type="dxa"/>
-              <w:left w:w="120" w:type="dxa"/>
-              <w:bottom w:w="80" w:type="dxa"/>
-              <w:right w:w="120" w:type="dxa"/>
-            </w:tcMar>
-          </w:tcPr>
-          <w:p>
-            <w:r>
-              <w:rPr>
-                <w:sz w:val="18"/>
-                <w:szCs w:val="18"/>
-              </w:rPr>
-              <w:t>9</w:t>
-            </w:r>
-          </w:p>
-        </w:tc>
-        <w:tc>
-          <w:tcPr>
-            <w:tcW w:w="4000" w:type="dxa"/>
-            <w:tcBorders>
-              <w:top w:val="single" w:sz="1" w:space="0" w:color="CCCCCC"/>
-              <w:left w:val="single" w:sz="1" w:space="0" w:color="CCCCCC"/>
-              <w:bottom w:val="single" w:sz="1" w:space="0" w:color="CCCCCC"/>
-              <w:right w:val="single" w:sz="1" w:space="0" w:color="CCCCCC"/>
-            </w:tcBorders>
-            <w:shd w:val="clear" w:color="auto" w:fill="FFFFFF"/>
-            <w:tcMar>
-              <w:top w:w="80" w:type="dxa"/>
-              <w:left w:w="120" w:type="dxa"/>
-              <w:bottom w:w="80" w:type="dxa"/>
-              <w:right w:w="120" w:type="dxa"/>
-            </w:tcMar>
-          </w:tcPr>
-          <w:p>
-            <w:r>
-              <w:rPr>
-                <w:sz w:val="18"/>
-                <w:szCs w:val="18"/>
-              </w:rPr>
-              <w:t>International address formats: Make scenario may produce column-shifted rows for non-US/CA addresses (confirmed for Estonia). Fix in Make Module 5 column mappings.</w:t>
-            </w:r>
-          </w:p>
-        </w:tc>
-        <w:tc>
-          <w:tcPr>
-            <w:tcW w:w="1800" w:type="dxa"/>
-            <w:tcBorders>
-              <w:top w:val="single" w:sz="1" w:space="0" w:color="CCCCCC"/>
-              <w:left w:val="single" w:sz="1" w:space="0" w:color="CCCCCC"/>
-              <w:bottom w:val="single" w:sz="1" w:space="0" w:color="CCCCCC"/>
-              <w:right w:val="single" w:sz="1" w:space="0" w:color="CCCCCC"/>
-            </w:tcBorders>
-            <w:shd w:val="clear" w:color="auto" w:fill="FFFFFF"/>
-            <w:tcMar>
-              <w:top w:w="80" w:type="dxa"/>
-              <w:left w:w="120" w:type="dxa"/>
-              <w:bottom w:w="80" w:type="dxa"/>
-              <w:right w:w="120" w:type="dxa"/>
-            </w:tcMar>
-          </w:tcPr>
-          <w:p>
-            <w:r>
-              <w:rPr>
-                <w:sz w:val="18"/>
-                <w:szCs w:val="18"/>
-              </w:rPr>
-              <w:t>Developer</w:t>
-            </w:r>
-          </w:p>
-        </w:tc>
-        <w:tc>
-          <w:tcPr>
-            <w:tcW w:w="3210" w:type="dxa"/>
-            <w:tcBorders>
-              <w:top w:val="single" w:sz="1" w:space="0" w:color="CCCCCC"/>
-              <w:left w:val="single" w:sz="1" w:space="0" w:color="CCCCCC"/>
-              <w:bottom w:val="single" w:sz="1" w:space="0" w:color="CCCCCC"/>
-              <w:right w:val="single" w:sz="1" w:space="0" w:color="CCCCCC"/>
-            </w:tcBorders>
-            <w:shd w:val="clear" w:color="auto" w:fill="FFFFFF"/>
-            <w:tcMar>
-              <w:top w:w="80" w:type="dxa"/>
-              <w:left w:w="120" w:type="dxa"/>
-              <w:bottom w:w="80" w:type="dxa"/>
-              <w:right w:w="120" w:type="dxa"/>
-            </w:tcMar>
-          </w:tcPr>
-          <w:p>
-            <w:r>
-              <w:rPr>
-                <w:sz w:val="18"/>
-                <w:szCs w:val="18"/>
-              </w:rPr>
-              <w:t>Open — validation catches and hard-skips affected rows</w:t>
-            </w:r>
-          </w:p>
-        </w:tc>
-      </w:tr>
-      <w:tr>
-        <w:tc>
-          <w:tcPr>
-            <w:tcW w:w="350" w:type="dxa"/>
+            <w:tcW w:w="441" w:type="dxa"/>
             <w:tcBorders>
               <w:top w:val="single" w:sz="1" w:space="0" w:color="CCCCCC"/>
               <w:left w:val="single" w:sz="1" w:space="0" w:color="CCCCCC"/>
@@ -20132,7 +19942,7 @@
         </w:tc>
         <w:tc>
           <w:tcPr>
-            <w:tcW w:w="4000" w:type="dxa"/>
+            <w:tcW w:w="3990" w:type="dxa"/>
             <w:tcBorders>
               <w:top w:val="single" w:sz="1" w:space="0" w:color="CCCCCC"/>
               <w:left w:val="single" w:sz="1" w:space="0" w:color="CCCCCC"/>
@@ -20191,7 +20001,7 @@
         </w:tc>
         <w:tc>
           <w:tcPr>
-            <w:tcW w:w="1800" w:type="dxa"/>
+            <w:tcW w:w="1780" w:type="dxa"/>
             <w:tcBorders>
               <w:top w:val="single" w:sz="1" w:space="0" w:color="CCCCCC"/>
               <w:left w:val="single" w:sz="1" w:space="0" w:color="CCCCCC"/>
@@ -20218,7 +20028,7 @@
         </w:tc>
         <w:tc>
           <w:tcPr>
-            <w:tcW w:w="3210" w:type="dxa"/>
+            <w:tcW w:w="3149" w:type="dxa"/>
             <w:tcBorders>
               <w:top w:val="single" w:sz="1" w:space="0" w:color="CCCCCC"/>
               <w:left w:val="single" w:sz="1" w:space="0" w:color="CCCCCC"/>
@@ -20697,7 +20507,6 @@
                 <w:sz w:val="18"/>
                 <w:szCs w:val="18"/>
               </w:rPr>
-              <w:lastRenderedPageBreak/>
               <w:t>build_glueup_index(all_records)</w:t>
             </w:r>
           </w:p>
@@ -20754,6 +20563,7 @@
                 <w:sz w:val="18"/>
                 <w:szCs w:val="18"/>
               </w:rPr>
+              <w:lastRenderedPageBreak/>
               <w:t>should_skip(row)</w:t>
             </w:r>
           </w:p>
@@ -21810,7 +21620,6 @@
         <w:spacing w:after="80"/>
       </w:pPr>
       <w:r>
-        <w:lastRenderedPageBreak/>
         <w:t>ZipCodes_Areas_CCC.xlsx missing: log warning, all members get 'No Region', continue.</w:t>
       </w:r>
     </w:p>
@@ -23064,35 +22873,42 @@
                 <w:sz w:val="18"/>
                 <w:szCs w:val="18"/>
               </w:rPr>
+              <w:t>1.20</w:t>
+            </w:r>
+          </w:p>
+        </w:tc>
+        <w:tc>
+          <w:tcPr>
+            <w:tcW w:w="8172" w:type="dxa"/>
+            <w:tcBorders>
+              <w:top w:val="single" w:sz="1" w:space="0" w:color="CCCCCC"/>
+              <w:left w:val="single" w:sz="1" w:space="0" w:color="CCCCCC"/>
+              <w:bottom w:val="single" w:sz="1" w:space="0" w:color="CCCCCC"/>
+              <w:right w:val="single" w:sz="1" w:space="0" w:color="CCCCCC"/>
+            </w:tcBorders>
+            <w:shd w:val="clear" w:color="auto" w:fill="FFFFFF"/>
+            <w:tcMar>
+              <w:top w:w="80" w:type="dxa"/>
+              <w:left w:w="120" w:type="dxa"/>
+              <w:bottom w:w="80" w:type="dxa"/>
+              <w:right w:w="120" w:type="dxa"/>
+            </w:tcMar>
+          </w:tcPr>
+          <w:p>
+            <w:r>
+              <w:rPr>
+                <w:sz w:val="18"/>
+                <w:szCs w:val="18"/>
+              </w:rPr>
+              <w:t xml:space="preserve">Migrated to Google Cloud Run. Script now runs as a Cloud Run job (glueup-sync, us-west1, project gg-sync-492000) triggered by Cloud Scheduler (glueup-sync-weekly, Mondays 9:00 AM Pacific). Service account glueup-sync@gg-sync-492000.iam.gserviceaccount.com replaces OAuth 2.0 </w:t>
+            </w:r>
+            <w:r>
+              <w:rPr>
+                <w:sz w:val="18"/>
+                <w:szCs w:val="18"/>
+              </w:rPr>
               <w:lastRenderedPageBreak/>
-              <w:t>1.20</w:t>
-            </w:r>
-          </w:p>
-        </w:tc>
-        <w:tc>
-          <w:tcPr>
-            <w:tcW w:w="8172" w:type="dxa"/>
-            <w:tcBorders>
-              <w:top w:val="single" w:sz="1" w:space="0" w:color="CCCCCC"/>
-              <w:left w:val="single" w:sz="1" w:space="0" w:color="CCCCCC"/>
-              <w:bottom w:val="single" w:sz="1" w:space="0" w:color="CCCCCC"/>
-              <w:right w:val="single" w:sz="1" w:space="0" w:color="CCCCCC"/>
-            </w:tcBorders>
-            <w:shd w:val="clear" w:color="auto" w:fill="FFFFFF"/>
-            <w:tcMar>
-              <w:top w:w="80" w:type="dxa"/>
-              <w:left w:w="120" w:type="dxa"/>
-              <w:bottom w:w="80" w:type="dxa"/>
-              <w:right w:w="120" w:type="dxa"/>
-            </w:tcMar>
-          </w:tcPr>
-          <w:p>
-            <w:r>
-              <w:rPr>
-                <w:sz w:val="18"/>
-                <w:szCs w:val="18"/>
-              </w:rPr>
-              <w:t>Migrated to Google Cloud Run. Script now runs as a Cloud Run job (glueup-sync, us-west1, project gg-sync-492000) triggered by Cloud Scheduler (glueup-sync-weekly, Mondays 9:00 AM Pacific). Service account glueup-sync@gg-sync-492000.iam.gserviceaccount.com replaces OAuth 2.0 credentials.json / drive_token.json flow for Drive access. No-file-present path sends notification email and exits cleanly. Updated Section 7 Operational Workflow. Closed Open Item 15.</w:t>
+              <w:t>credentials.json / drive_token.json flow for Drive access. No-file-present path sends notification email and exits cleanly. Updated Section 7 Operational Workflow. Closed Open Item 15.</w:t>
             </w:r>
           </w:p>
         </w:tc>
@@ -23121,6 +22937,7 @@
                 <w:sz w:val="18"/>
                 <w:szCs w:val="18"/>
               </w:rPr>
+              <w:lastRenderedPageBreak/>
               <w:t>1.21</w:t>
             </w:r>
           </w:p>
@@ -23217,6 +23034,1330 @@
                 <w:szCs w:val="18"/>
               </w:rPr>
               <w:t>Tweaked the error output from drive upload to “See the Design Spec” rather than a specific section number. Added supportsAllDrives = true to both the subfolder creation and file upload. This flag is required ay time the target is a Shared Drive rather than My Drive.</w:t>
+            </w:r>
+          </w:p>
+        </w:tc>
+      </w:tr>
+      <w:tr>
+        <w:tc>
+          <w:tcPr>
+            <w:tcW w:w="1080" w:type="dxa"/>
+            <w:tcBorders>
+              <w:top w:val="single" w:sz="1" w:space="0" w:color="CCCCCC"/>
+              <w:left w:val="single" w:sz="1" w:space="0" w:color="CCCCCC"/>
+              <w:bottom w:val="single" w:sz="1" w:space="0" w:color="CCCCCC"/>
+              <w:right w:val="single" w:sz="1" w:space="0" w:color="CCCCCC"/>
+            </w:tcBorders>
+            <w:shd w:val="clear" w:color="auto" w:fill="FFFFFF"/>
+            <w:tcMar>
+              <w:top w:w="80" w:type="dxa"/>
+              <w:left w:w="120" w:type="dxa"/>
+              <w:bottom w:w="80" w:type="dxa"/>
+              <w:right w:w="120" w:type="dxa"/>
+            </w:tcMar>
+          </w:tcPr>
+          <w:p>
+            <w:pPr>
+              <w:rPr>
+                <w:sz w:val="18"/>
+                <w:szCs w:val="18"/>
+              </w:rPr>
+            </w:pPr>
+            <w:r>
+              <w:rPr>
+                <w:sz w:val="18"/>
+                <w:szCs w:val="18"/>
+              </w:rPr>
+              <w:t>2.0.0</w:t>
+            </w:r>
+          </w:p>
+        </w:tc>
+        <w:tc>
+          <w:tcPr>
+            <w:tcW w:w="8280" w:type="dxa"/>
+            <w:tcBorders>
+              <w:top w:val="single" w:sz="1" w:space="0" w:color="CCCCCC"/>
+              <w:left w:val="single" w:sz="1" w:space="0" w:color="CCCCCC"/>
+              <w:bottom w:val="single" w:sz="1" w:space="0" w:color="CCCCCC"/>
+              <w:right w:val="single" w:sz="1" w:space="0" w:color="CCCCCC"/>
+            </w:tcBorders>
+            <w:shd w:val="clear" w:color="auto" w:fill="FFFFFF"/>
+            <w:tcMar>
+              <w:top w:w="80" w:type="dxa"/>
+              <w:left w:w="120" w:type="dxa"/>
+              <w:bottom w:w="80" w:type="dxa"/>
+              <w:right w:w="120" w:type="dxa"/>
+            </w:tcMar>
+          </w:tcPr>
+          <w:p>
+            <w:pPr>
+              <w:rPr>
+                <w:sz w:val="18"/>
+                <w:szCs w:val="18"/>
+              </w:rPr>
+            </w:pPr>
+            <w:r>
+              <w:rPr>
+                <w:sz w:val="18"/>
+                <w:szCs w:val="18"/>
+              </w:rPr>
+              <w:t xml:space="preserve">  - Cloud Run migration: replaced OAuth 2.0 browser flow in _</w:t>
+            </w:r>
+            <w:proofErr w:type="spellStart"/>
+            <w:r>
+              <w:rPr>
+                <w:sz w:val="18"/>
+                <w:szCs w:val="18"/>
+              </w:rPr>
+              <w:t>get_drive_</w:t>
+            </w:r>
+            <w:proofErr w:type="gramStart"/>
+            <w:r>
+              <w:rPr>
+                <w:sz w:val="18"/>
+                <w:szCs w:val="18"/>
+              </w:rPr>
+              <w:t>service</w:t>
+            </w:r>
+            <w:proofErr w:type="spellEnd"/>
+            <w:r>
+              <w:rPr>
+                <w:sz w:val="18"/>
+                <w:szCs w:val="18"/>
+              </w:rPr>
+              <w:t>(</w:t>
+            </w:r>
+            <w:proofErr w:type="gramEnd"/>
+            <w:r>
+              <w:rPr>
+                <w:sz w:val="18"/>
+                <w:szCs w:val="18"/>
+              </w:rPr>
+              <w:t>)</w:t>
+            </w:r>
+          </w:p>
+          <w:p>
+            <w:pPr>
+              <w:rPr>
+                <w:sz w:val="18"/>
+                <w:szCs w:val="18"/>
+              </w:rPr>
+            </w:pPr>
+            <w:r>
+              <w:rPr>
+                <w:sz w:val="18"/>
+                <w:szCs w:val="18"/>
+              </w:rPr>
+              <w:t xml:space="preserve">    with Application Default Credentials (ADC). On Cloud Run the service account</w:t>
+            </w:r>
+          </w:p>
+          <w:p>
+            <w:pPr>
+              <w:rPr>
+                <w:sz w:val="18"/>
+                <w:szCs w:val="18"/>
+              </w:rPr>
+            </w:pPr>
+            <w:r>
+              <w:rPr>
+                <w:sz w:val="18"/>
+                <w:szCs w:val="18"/>
+              </w:rPr>
+              <w:t xml:space="preserve">    supplies credentials automatically; locally use '</w:t>
+            </w:r>
+            <w:proofErr w:type="spellStart"/>
+            <w:r>
+              <w:rPr>
+                <w:sz w:val="18"/>
+                <w:szCs w:val="18"/>
+              </w:rPr>
+              <w:t>gcloud</w:t>
+            </w:r>
+            <w:proofErr w:type="spellEnd"/>
+            <w:r>
+              <w:rPr>
+                <w:sz w:val="18"/>
+                <w:szCs w:val="18"/>
+              </w:rPr>
+              <w:t xml:space="preserve"> auth application-default login'.</w:t>
+            </w:r>
+          </w:p>
+          <w:p>
+            <w:pPr>
+              <w:rPr>
+                <w:sz w:val="18"/>
+                <w:szCs w:val="18"/>
+              </w:rPr>
+            </w:pPr>
+            <w:r>
+              <w:rPr>
+                <w:sz w:val="18"/>
+                <w:szCs w:val="18"/>
+              </w:rPr>
+              <w:t xml:space="preserve">  - </w:t>
+            </w:r>
+            <w:proofErr w:type="spellStart"/>
+            <w:r>
+              <w:rPr>
+                <w:sz w:val="18"/>
+                <w:szCs w:val="18"/>
+              </w:rPr>
+              <w:t>GlueUp</w:t>
+            </w:r>
+            <w:proofErr w:type="spellEnd"/>
+            <w:r>
+              <w:rPr>
+                <w:sz w:val="18"/>
+                <w:szCs w:val="18"/>
+              </w:rPr>
+              <w:t xml:space="preserve"> auth: replaced token-file approach (</w:t>
+            </w:r>
+            <w:proofErr w:type="spellStart"/>
+            <w:r>
+              <w:rPr>
+                <w:sz w:val="18"/>
+                <w:szCs w:val="18"/>
+              </w:rPr>
+              <w:t>glueup_</w:t>
+            </w:r>
+            <w:proofErr w:type="gramStart"/>
+            <w:r>
+              <w:rPr>
+                <w:sz w:val="18"/>
+                <w:szCs w:val="18"/>
+              </w:rPr>
+              <w:t>token.json</w:t>
+            </w:r>
+            <w:proofErr w:type="spellEnd"/>
+            <w:proofErr w:type="gramEnd"/>
+            <w:r>
+              <w:rPr>
+                <w:sz w:val="18"/>
+                <w:szCs w:val="18"/>
+              </w:rPr>
+              <w:t>) with direct</w:t>
+            </w:r>
+          </w:p>
+          <w:p>
+            <w:pPr>
+              <w:rPr>
+                <w:sz w:val="18"/>
+                <w:szCs w:val="18"/>
+              </w:rPr>
+            </w:pPr>
+            <w:r>
+              <w:rPr>
+                <w:sz w:val="18"/>
+                <w:szCs w:val="18"/>
+              </w:rPr>
+              <w:t xml:space="preserve">    HMAC-SHA256 authentication. </w:t>
+            </w:r>
+            <w:proofErr w:type="spellStart"/>
+            <w:r>
+              <w:rPr>
+                <w:sz w:val="18"/>
+                <w:szCs w:val="18"/>
+              </w:rPr>
+              <w:t>glueup_</w:t>
+            </w:r>
+            <w:proofErr w:type="gramStart"/>
+            <w:r>
+              <w:rPr>
+                <w:sz w:val="18"/>
+                <w:szCs w:val="18"/>
+              </w:rPr>
+              <w:t>auth</w:t>
+            </w:r>
+            <w:proofErr w:type="spellEnd"/>
+            <w:r>
+              <w:rPr>
+                <w:sz w:val="18"/>
+                <w:szCs w:val="18"/>
+              </w:rPr>
+              <w:t>(</w:t>
+            </w:r>
+            <w:proofErr w:type="gramEnd"/>
+            <w:r>
+              <w:rPr>
+                <w:sz w:val="18"/>
+                <w:szCs w:val="18"/>
+              </w:rPr>
+              <w:t xml:space="preserve">) now calls the </w:t>
+            </w:r>
+            <w:proofErr w:type="spellStart"/>
+            <w:r>
+              <w:rPr>
+                <w:sz w:val="18"/>
+                <w:szCs w:val="18"/>
+              </w:rPr>
+              <w:t>GlueUp</w:t>
+            </w:r>
+            <w:proofErr w:type="spellEnd"/>
+            <w:r>
+              <w:rPr>
+                <w:sz w:val="18"/>
+                <w:szCs w:val="18"/>
+              </w:rPr>
+              <w:t xml:space="preserve"> session</w:t>
+            </w:r>
+          </w:p>
+          <w:p>
+            <w:pPr>
+              <w:rPr>
+                <w:sz w:val="18"/>
+                <w:szCs w:val="18"/>
+              </w:rPr>
+            </w:pPr>
+            <w:r>
+              <w:rPr>
+                <w:sz w:val="18"/>
+                <w:szCs w:val="18"/>
+              </w:rPr>
+              <w:t xml:space="preserve">    endpoint and returns a live token — no pre-generated token file required.</w:t>
+            </w:r>
+          </w:p>
+          <w:p>
+            <w:pPr>
+              <w:rPr>
+                <w:sz w:val="18"/>
+                <w:szCs w:val="18"/>
+              </w:rPr>
+            </w:pPr>
+            <w:r>
+              <w:rPr>
+                <w:sz w:val="18"/>
+                <w:szCs w:val="18"/>
+              </w:rPr>
+              <w:t xml:space="preserve">  - Secret Manager: added _</w:t>
+            </w:r>
+            <w:proofErr w:type="spellStart"/>
+            <w:r>
+              <w:rPr>
+                <w:sz w:val="18"/>
+                <w:szCs w:val="18"/>
+              </w:rPr>
+              <w:t>load_secrets_from_secret_</w:t>
+            </w:r>
+            <w:proofErr w:type="gramStart"/>
+            <w:r>
+              <w:rPr>
+                <w:sz w:val="18"/>
+                <w:szCs w:val="18"/>
+              </w:rPr>
+              <w:t>manager</w:t>
+            </w:r>
+            <w:proofErr w:type="spellEnd"/>
+            <w:r>
+              <w:rPr>
+                <w:sz w:val="18"/>
+                <w:szCs w:val="18"/>
+              </w:rPr>
+              <w:t>(</w:t>
+            </w:r>
+            <w:proofErr w:type="gramEnd"/>
+            <w:r>
+              <w:rPr>
+                <w:sz w:val="18"/>
+                <w:szCs w:val="18"/>
+              </w:rPr>
+              <w:t>) — when</w:t>
+            </w:r>
+          </w:p>
+          <w:p>
+            <w:pPr>
+              <w:rPr>
+                <w:sz w:val="18"/>
+                <w:szCs w:val="18"/>
+              </w:rPr>
+            </w:pPr>
+            <w:r>
+              <w:rPr>
+                <w:sz w:val="18"/>
+                <w:szCs w:val="18"/>
+              </w:rPr>
+              <w:t xml:space="preserve">    GLUEUP_USE_SECRET_MANAGER=1 is set (Cloud Run), GLUEUP_SK is fetched</w:t>
+            </w:r>
+          </w:p>
+          <w:p>
+            <w:pPr>
+              <w:rPr>
+                <w:sz w:val="18"/>
+                <w:szCs w:val="18"/>
+              </w:rPr>
+            </w:pPr>
+            <w:r>
+              <w:rPr>
+                <w:sz w:val="18"/>
+                <w:szCs w:val="18"/>
+              </w:rPr>
+              <w:t xml:space="preserve">    from GCP Secret Manager at startup, overriding the hardcoded fallback.</w:t>
+            </w:r>
+          </w:p>
+          <w:p>
+            <w:pPr>
+              <w:rPr>
+                <w:sz w:val="18"/>
+                <w:szCs w:val="18"/>
+              </w:rPr>
+            </w:pPr>
+            <w:r>
+              <w:rPr>
+                <w:sz w:val="18"/>
+                <w:szCs w:val="18"/>
+              </w:rPr>
+              <w:t xml:space="preserve">  - Drive download: added </w:t>
+            </w:r>
+            <w:proofErr w:type="spellStart"/>
+            <w:r>
+              <w:rPr>
+                <w:sz w:val="18"/>
+                <w:szCs w:val="18"/>
+              </w:rPr>
+              <w:t>download_latest_icf_file_from_</w:t>
+            </w:r>
+            <w:proofErr w:type="gramStart"/>
+            <w:r>
+              <w:rPr>
+                <w:sz w:val="18"/>
+                <w:szCs w:val="18"/>
+              </w:rPr>
+              <w:t>drive</w:t>
+            </w:r>
+            <w:proofErr w:type="spellEnd"/>
+            <w:r>
+              <w:rPr>
+                <w:sz w:val="18"/>
+                <w:szCs w:val="18"/>
+              </w:rPr>
+              <w:t>(</w:t>
+            </w:r>
+            <w:proofErr w:type="gramEnd"/>
+            <w:r>
+              <w:rPr>
+                <w:sz w:val="18"/>
+                <w:szCs w:val="18"/>
+              </w:rPr>
+              <w:t>) — when no</w:t>
+            </w:r>
+          </w:p>
+          <w:p>
+            <w:pPr>
+              <w:rPr>
+                <w:sz w:val="18"/>
+                <w:szCs w:val="18"/>
+              </w:rPr>
+            </w:pPr>
+            <w:r>
+              <w:rPr>
+                <w:sz w:val="18"/>
+                <w:szCs w:val="18"/>
+              </w:rPr>
+              <w:t xml:space="preserve">    local </w:t>
+            </w:r>
+            <w:proofErr w:type="spellStart"/>
+            <w:r>
+              <w:rPr>
+                <w:sz w:val="18"/>
+                <w:szCs w:val="18"/>
+              </w:rPr>
+              <w:t>activemembers</w:t>
+            </w:r>
+            <w:proofErr w:type="spellEnd"/>
+            <w:r>
+              <w:rPr>
+                <w:sz w:val="18"/>
+                <w:szCs w:val="18"/>
+              </w:rPr>
+              <w:t xml:space="preserve"> CSV is found, the script downloads the most recent</w:t>
+            </w:r>
+          </w:p>
+          <w:p>
+            <w:pPr>
+              <w:rPr>
+                <w:sz w:val="18"/>
+                <w:szCs w:val="18"/>
+              </w:rPr>
+            </w:pPr>
+            <w:r>
+              <w:rPr>
+                <w:sz w:val="18"/>
+                <w:szCs w:val="18"/>
+              </w:rPr>
+              <w:t xml:space="preserve">    one from the Drive Inbound folder (DRIVE_INBOUND_FOLDER_ID).</w:t>
+            </w:r>
+          </w:p>
+          <w:p>
+            <w:pPr>
+              <w:rPr>
+                <w:sz w:val="18"/>
+                <w:szCs w:val="18"/>
+              </w:rPr>
+            </w:pPr>
+            <w:r>
+              <w:rPr>
+                <w:sz w:val="18"/>
+                <w:szCs w:val="18"/>
+              </w:rPr>
+              <w:t xml:space="preserve">  - Drive move: after successful upload, the inbound CSV is moved to the</w:t>
+            </w:r>
+          </w:p>
+          <w:p>
+            <w:pPr>
+              <w:rPr>
+                <w:sz w:val="18"/>
+                <w:szCs w:val="18"/>
+              </w:rPr>
+            </w:pPr>
+            <w:r>
+              <w:rPr>
+                <w:sz w:val="18"/>
+                <w:szCs w:val="18"/>
+              </w:rPr>
+              <w:t xml:space="preserve">    Processed folder (DRIVE_PROCESSED_FOLDER_ID) so it is not reprocessed.</w:t>
+            </w:r>
+          </w:p>
+          <w:p>
+            <w:pPr>
+              <w:rPr>
+                <w:sz w:val="18"/>
+                <w:szCs w:val="18"/>
+              </w:rPr>
+            </w:pPr>
+            <w:r>
+              <w:rPr>
+                <w:sz w:val="18"/>
+                <w:szCs w:val="18"/>
+              </w:rPr>
+              <w:t xml:space="preserve">  - Notifications: added SendGrid email notifications — 'Import Ready' after</w:t>
+            </w:r>
+          </w:p>
+          <w:p>
+            <w:pPr>
+              <w:rPr>
+                <w:sz w:val="18"/>
+                <w:szCs w:val="18"/>
+              </w:rPr>
+            </w:pPr>
+            <w:r>
+              <w:rPr>
+                <w:sz w:val="18"/>
+                <w:szCs w:val="18"/>
+              </w:rPr>
+              <w:t xml:space="preserve">    a successful run, 'No Inbound File' warning when the Inbound folder is empty.</w:t>
+            </w:r>
+          </w:p>
+          <w:p>
+            <w:pPr>
+              <w:rPr>
+                <w:sz w:val="18"/>
+                <w:szCs w:val="18"/>
+              </w:rPr>
+            </w:pPr>
+            <w:r>
+              <w:rPr>
+                <w:sz w:val="18"/>
+                <w:szCs w:val="18"/>
+              </w:rPr>
+              <w:t xml:space="preserve">  - DRIVE_SCOPES broadened from </w:t>
+            </w:r>
+            <w:proofErr w:type="spellStart"/>
+            <w:proofErr w:type="gramStart"/>
+            <w:r>
+              <w:rPr>
+                <w:sz w:val="18"/>
+                <w:szCs w:val="18"/>
+              </w:rPr>
+              <w:t>drive.file</w:t>
+            </w:r>
+            <w:proofErr w:type="spellEnd"/>
+            <w:proofErr w:type="gramEnd"/>
+            <w:r>
+              <w:rPr>
+                <w:sz w:val="18"/>
+                <w:szCs w:val="18"/>
+              </w:rPr>
+              <w:t xml:space="preserve"> to drive for Shared Drive access.</w:t>
+            </w:r>
+          </w:p>
+          <w:p>
+            <w:pPr>
+              <w:rPr>
+                <w:sz w:val="18"/>
+                <w:szCs w:val="18"/>
+              </w:rPr>
+            </w:pPr>
+            <w:r>
+              <w:rPr>
+                <w:sz w:val="18"/>
+                <w:szCs w:val="18"/>
+              </w:rPr>
+              <w:t xml:space="preserve">  - Added DRIVE_INBOUND_FOLDER_ID and DRIVE_PROCESSED_FOLDER_ID constants.</w:t>
+            </w:r>
+          </w:p>
+          <w:p>
+            <w:pPr>
+              <w:rPr>
+                <w:sz w:val="18"/>
+                <w:szCs w:val="18"/>
+              </w:rPr>
+            </w:pPr>
+            <w:r>
+              <w:rPr>
+                <w:sz w:val="18"/>
+                <w:szCs w:val="18"/>
+              </w:rPr>
+              <w:t xml:space="preserve">  - Added GLUEUP_MD5_PW and GLUEUP_EMAIL constants for headless auth.</w:t>
+            </w:r>
+          </w:p>
+          <w:p>
+            <w:pPr>
+              <w:rPr>
+                <w:sz w:val="18"/>
+                <w:szCs w:val="18"/>
+              </w:rPr>
+            </w:pPr>
+            <w:r>
+              <w:rPr>
+                <w:sz w:val="18"/>
+                <w:szCs w:val="18"/>
+              </w:rPr>
+              <w:t xml:space="preserve">  - Removed DRIVE_TOKEN_FILE, DRIVE_CREDENTIALS, TOKEN_FILE references.</w:t>
+            </w:r>
+          </w:p>
+        </w:tc>
+      </w:tr>
+      <w:tr>
+        <w:tc>
+          <w:tcPr>
+            <w:tcW w:w="1080" w:type="dxa"/>
+            <w:tcBorders>
+              <w:top w:val="single" w:sz="1" w:space="0" w:color="CCCCCC"/>
+              <w:left w:val="single" w:sz="1" w:space="0" w:color="CCCCCC"/>
+              <w:bottom w:val="single" w:sz="1" w:space="0" w:color="CCCCCC"/>
+              <w:right w:val="single" w:sz="1" w:space="0" w:color="CCCCCC"/>
+            </w:tcBorders>
+            <w:shd w:val="clear" w:color="auto" w:fill="FFFFFF"/>
+            <w:tcMar>
+              <w:top w:w="80" w:type="dxa"/>
+              <w:left w:w="120" w:type="dxa"/>
+              <w:bottom w:w="80" w:type="dxa"/>
+              <w:right w:w="120" w:type="dxa"/>
+            </w:tcMar>
+          </w:tcPr>
+          <w:p>
+            <w:pPr>
+              <w:rPr>
+                <w:sz w:val="18"/>
+                <w:szCs w:val="18"/>
+              </w:rPr>
+            </w:pPr>
+            <w:r>
+              <w:rPr>
+                <w:sz w:val="18"/>
+                <w:szCs w:val="18"/>
+              </w:rPr>
+              <w:t>2.0.1</w:t>
+            </w:r>
+          </w:p>
+        </w:tc>
+        <w:tc>
+          <w:tcPr>
+            <w:tcW w:w="8280" w:type="dxa"/>
+            <w:tcBorders>
+              <w:top w:val="single" w:sz="1" w:space="0" w:color="CCCCCC"/>
+              <w:left w:val="single" w:sz="1" w:space="0" w:color="CCCCCC"/>
+              <w:bottom w:val="single" w:sz="1" w:space="0" w:color="CCCCCC"/>
+              <w:right w:val="single" w:sz="1" w:space="0" w:color="CCCCCC"/>
+            </w:tcBorders>
+            <w:shd w:val="clear" w:color="auto" w:fill="FFFFFF"/>
+            <w:tcMar>
+              <w:top w:w="80" w:type="dxa"/>
+              <w:left w:w="120" w:type="dxa"/>
+              <w:bottom w:w="80" w:type="dxa"/>
+              <w:right w:w="120" w:type="dxa"/>
+            </w:tcMar>
+          </w:tcPr>
+          <w:p>
+            <w:pPr>
+              <w:rPr>
+                <w:sz w:val="18"/>
+                <w:szCs w:val="18"/>
+              </w:rPr>
+            </w:pPr>
+            <w:r>
+              <w:rPr>
+                <w:sz w:val="18"/>
+                <w:szCs w:val="18"/>
+              </w:rPr>
+              <w:t xml:space="preserve">  - Updated import-ready notification email: steps 2 and 3 now correctly</w:t>
+            </w:r>
+          </w:p>
+          <w:p>
+            <w:pPr>
+              <w:rPr>
+                <w:sz w:val="18"/>
+                <w:szCs w:val="18"/>
+              </w:rPr>
+            </w:pPr>
+            <w:r>
+              <w:rPr>
+                <w:sz w:val="18"/>
+                <w:szCs w:val="18"/>
+              </w:rPr>
+              <w:t xml:space="preserve">    reference contact_import_*.xlsx (Contacts → Import) and</w:t>
+            </w:r>
+          </w:p>
+          <w:p>
+            <w:pPr>
+              <w:rPr>
+                <w:sz w:val="18"/>
+                <w:szCs w:val="18"/>
+              </w:rPr>
+            </w:pPr>
+            <w:r>
+              <w:rPr>
+                <w:sz w:val="18"/>
+                <w:szCs w:val="18"/>
+              </w:rPr>
+              <w:t xml:space="preserve">    membership_import_*.xlsx (Memberships → Import) separately, and</w:t>
+            </w:r>
+          </w:p>
+          <w:p>
+            <w:pPr>
+              <w:rPr>
+                <w:sz w:val="18"/>
+                <w:szCs w:val="18"/>
+              </w:rPr>
+            </w:pPr>
+            <w:r>
+              <w:rPr>
+                <w:sz w:val="18"/>
+                <w:szCs w:val="18"/>
+              </w:rPr>
+              <w:t xml:space="preserve">    reference the "ICF Global </w:t>
+            </w:r>
+            <w:proofErr w:type="spellStart"/>
+            <w:r>
+              <w:rPr>
+                <w:sz w:val="18"/>
+                <w:szCs w:val="18"/>
+              </w:rPr>
+              <w:t>GlueUp</w:t>
+            </w:r>
+            <w:proofErr w:type="spellEnd"/>
+            <w:r>
+              <w:rPr>
+                <w:sz w:val="18"/>
+                <w:szCs w:val="18"/>
+              </w:rPr>
+              <w:t xml:space="preserve"> Sync Operations" doc for full instructions.</w:t>
+            </w:r>
+          </w:p>
+        </w:tc>
+      </w:tr>
+      <w:tr>
+        <w:tc>
+          <w:tcPr>
+            <w:tcW w:w="1080" w:type="dxa"/>
+            <w:tcBorders>
+              <w:top w:val="single" w:sz="1" w:space="0" w:color="CCCCCC"/>
+              <w:left w:val="single" w:sz="1" w:space="0" w:color="CCCCCC"/>
+              <w:bottom w:val="single" w:sz="1" w:space="0" w:color="CCCCCC"/>
+              <w:right w:val="single" w:sz="1" w:space="0" w:color="CCCCCC"/>
+            </w:tcBorders>
+            <w:shd w:val="clear" w:color="auto" w:fill="FFFFFF"/>
+            <w:tcMar>
+              <w:top w:w="80" w:type="dxa"/>
+              <w:left w:w="120" w:type="dxa"/>
+              <w:bottom w:w="80" w:type="dxa"/>
+              <w:right w:w="120" w:type="dxa"/>
+            </w:tcMar>
+          </w:tcPr>
+          <w:p>
+            <w:pPr>
+              <w:rPr>
+                <w:sz w:val="18"/>
+                <w:szCs w:val="18"/>
+              </w:rPr>
+            </w:pPr>
+            <w:r>
+              <w:rPr>
+                <w:sz w:val="18"/>
+                <w:szCs w:val="18"/>
+              </w:rPr>
+              <w:t>2.1.0</w:t>
+            </w:r>
+          </w:p>
+        </w:tc>
+        <w:tc>
+          <w:tcPr>
+            <w:tcW w:w="8280" w:type="dxa"/>
+            <w:tcBorders>
+              <w:top w:val="single" w:sz="1" w:space="0" w:color="CCCCCC"/>
+              <w:left w:val="single" w:sz="1" w:space="0" w:color="CCCCCC"/>
+              <w:bottom w:val="single" w:sz="1" w:space="0" w:color="CCCCCC"/>
+              <w:right w:val="single" w:sz="1" w:space="0" w:color="CCCCCC"/>
+            </w:tcBorders>
+            <w:shd w:val="clear" w:color="auto" w:fill="FFFFFF"/>
+            <w:tcMar>
+              <w:top w:w="80" w:type="dxa"/>
+              <w:left w:w="120" w:type="dxa"/>
+              <w:bottom w:w="80" w:type="dxa"/>
+              <w:right w:w="120" w:type="dxa"/>
+            </w:tcMar>
+          </w:tcPr>
+          <w:p>
+            <w:pPr>
+              <w:rPr>
+                <w:sz w:val="18"/>
+                <w:szCs w:val="18"/>
+              </w:rPr>
+            </w:pPr>
+            <w:r>
+              <w:rPr>
+                <w:sz w:val="18"/>
+                <w:szCs w:val="18"/>
+              </w:rPr>
+              <w:t xml:space="preserve">  - Removed Make scenario row filter (Status = Active OR expiry &gt; now-365) from</w:t>
+            </w:r>
+          </w:p>
+          <w:p>
+            <w:pPr>
+              <w:rPr>
+                <w:sz w:val="18"/>
+                <w:szCs w:val="18"/>
+              </w:rPr>
+            </w:pPr>
+            <w:r>
+              <w:rPr>
+                <w:sz w:val="18"/>
+                <w:szCs w:val="18"/>
+              </w:rPr>
+              <w:t xml:space="preserve">    sync logic; ICF Global API now correctly returns only active members.</w:t>
+            </w:r>
+          </w:p>
+          <w:p>
+            <w:pPr>
+              <w:rPr>
+                <w:sz w:val="18"/>
+                <w:szCs w:val="18"/>
+              </w:rPr>
+            </w:pPr>
+            <w:r>
+              <w:rPr>
+                <w:sz w:val="18"/>
+                <w:szCs w:val="18"/>
+              </w:rPr>
+              <w:t xml:space="preserve">  - Sync logic redesigned: NEW members get contact + membership import;</w:t>
+            </w:r>
+          </w:p>
+          <w:p>
+            <w:pPr>
+              <w:rPr>
+                <w:sz w:val="18"/>
+                <w:szCs w:val="18"/>
+              </w:rPr>
+            </w:pPr>
+            <w:r>
+              <w:rPr>
+                <w:sz w:val="18"/>
+                <w:szCs w:val="18"/>
+              </w:rPr>
+              <w:t xml:space="preserve">    RENEWED members (expiry date advanced) get contact import + renewals report</w:t>
+            </w:r>
+          </w:p>
+          <w:p>
+            <w:pPr>
+              <w:rPr>
+                <w:sz w:val="18"/>
+                <w:szCs w:val="18"/>
+              </w:rPr>
+            </w:pPr>
+            <w:r>
+              <w:rPr>
+                <w:sz w:val="18"/>
+                <w:szCs w:val="18"/>
+              </w:rPr>
+              <w:t xml:space="preserve">    for manual </w:t>
+            </w:r>
+            <w:proofErr w:type="spellStart"/>
+            <w:r>
+              <w:rPr>
+                <w:sz w:val="18"/>
+                <w:szCs w:val="18"/>
+              </w:rPr>
+              <w:t>GlueUp</w:t>
+            </w:r>
+            <w:proofErr w:type="spellEnd"/>
+            <w:r>
+              <w:rPr>
+                <w:sz w:val="18"/>
+                <w:szCs w:val="18"/>
+              </w:rPr>
+              <w:t xml:space="preserve"> UI update; CHANGED members (other fields only) get contact</w:t>
+            </w:r>
+          </w:p>
+          <w:p>
+            <w:pPr>
+              <w:rPr>
+                <w:sz w:val="18"/>
+                <w:szCs w:val="18"/>
+              </w:rPr>
+            </w:pPr>
+            <w:r>
+              <w:rPr>
+                <w:sz w:val="18"/>
+                <w:szCs w:val="18"/>
+              </w:rPr>
+              <w:t xml:space="preserve">    import only. Membership import is no longer used for existing members.</w:t>
+            </w:r>
+          </w:p>
+          <w:p>
+            <w:pPr>
+              <w:rPr>
+                <w:sz w:val="18"/>
+                <w:szCs w:val="18"/>
+              </w:rPr>
+            </w:pPr>
+            <w:r>
+              <w:rPr>
+                <w:sz w:val="18"/>
+                <w:szCs w:val="18"/>
+              </w:rPr>
+              <w:t xml:space="preserve">  - Added dropped member detection: </w:t>
+            </w:r>
+            <w:proofErr w:type="spellStart"/>
+            <w:r>
+              <w:rPr>
+                <w:sz w:val="18"/>
+                <w:szCs w:val="18"/>
+              </w:rPr>
+              <w:t>GlueUp</w:t>
+            </w:r>
+            <w:proofErr w:type="spellEnd"/>
+            <w:r>
+              <w:rPr>
+                <w:sz w:val="18"/>
+                <w:szCs w:val="18"/>
+              </w:rPr>
+              <w:t xml:space="preserve"> records with an ICF Member ID not</w:t>
+            </w:r>
+          </w:p>
+          <w:p>
+            <w:pPr>
+              <w:rPr>
+                <w:sz w:val="18"/>
+                <w:szCs w:val="18"/>
+              </w:rPr>
+            </w:pPr>
+            <w:r>
+              <w:rPr>
+                <w:sz w:val="18"/>
+                <w:szCs w:val="18"/>
+              </w:rPr>
+              <w:t xml:space="preserve">    present in the current ICF Global export are flagged in dropped_members_*.xlsx</w:t>
+            </w:r>
+          </w:p>
+          <w:p>
+            <w:pPr>
+              <w:rPr>
+                <w:sz w:val="18"/>
+                <w:szCs w:val="18"/>
+              </w:rPr>
+            </w:pPr>
+            <w:r>
+              <w:rPr>
+                <w:sz w:val="18"/>
+                <w:szCs w:val="18"/>
+              </w:rPr>
+              <w:t xml:space="preserve">    for manual membership cancellation in </w:t>
+            </w:r>
+            <w:proofErr w:type="spellStart"/>
+            <w:r>
+              <w:rPr>
+                <w:sz w:val="18"/>
+                <w:szCs w:val="18"/>
+              </w:rPr>
+              <w:t>GlueUp</w:t>
+            </w:r>
+            <w:proofErr w:type="spellEnd"/>
+            <w:r>
+              <w:rPr>
+                <w:sz w:val="18"/>
+                <w:szCs w:val="18"/>
+              </w:rPr>
+              <w:t xml:space="preserve"> Admin UI.</w:t>
+            </w:r>
+          </w:p>
+          <w:p>
+            <w:pPr>
+              <w:rPr>
+                <w:sz w:val="18"/>
+                <w:szCs w:val="18"/>
+              </w:rPr>
+            </w:pPr>
+            <w:r>
+              <w:rPr>
+                <w:sz w:val="18"/>
+                <w:szCs w:val="18"/>
+              </w:rPr>
+              <w:t xml:space="preserve">  - New output file: renewals_*.xlsx — same structure as membership import,</w:t>
+            </w:r>
+          </w:p>
+          <w:p>
+            <w:pPr>
+              <w:rPr>
+                <w:sz w:val="18"/>
+                <w:szCs w:val="18"/>
+              </w:rPr>
+            </w:pPr>
+            <w:r>
+              <w:rPr>
+                <w:sz w:val="18"/>
+                <w:szCs w:val="18"/>
+              </w:rPr>
+              <w:t xml:space="preserve">    contains members whose expiration date has advanced; for manual processing.</w:t>
+            </w:r>
+          </w:p>
+          <w:p>
+            <w:pPr>
+              <w:rPr>
+                <w:sz w:val="18"/>
+                <w:szCs w:val="18"/>
+              </w:rPr>
+            </w:pPr>
+            <w:r>
+              <w:rPr>
+                <w:sz w:val="18"/>
+                <w:szCs w:val="18"/>
+              </w:rPr>
+              <w:t xml:space="preserve">  - New output file: dropped_members_*.xlsx — replaces the old </w:t>
+            </w:r>
+            <w:proofErr w:type="spellStart"/>
+            <w:r>
+              <w:rPr>
+                <w:sz w:val="18"/>
+                <w:szCs w:val="18"/>
+              </w:rPr>
+              <w:t>process_rows</w:t>
+            </w:r>
+            <w:proofErr w:type="spellEnd"/>
+          </w:p>
+          <w:p>
+            <w:pPr>
+              <w:rPr>
+                <w:sz w:val="18"/>
+                <w:szCs w:val="18"/>
+              </w:rPr>
+            </w:pPr>
+            <w:r>
+              <w:rPr>
+                <w:sz w:val="18"/>
+                <w:szCs w:val="18"/>
+              </w:rPr>
+              <w:t xml:space="preserve">    DROPPED logic; now generated directly from </w:t>
+            </w:r>
+            <w:proofErr w:type="spellStart"/>
+            <w:r>
+              <w:rPr>
+                <w:sz w:val="18"/>
+                <w:szCs w:val="18"/>
+              </w:rPr>
+              <w:t>GlueUp</w:t>
+            </w:r>
+            <w:proofErr w:type="spellEnd"/>
+            <w:r>
+              <w:rPr>
+                <w:sz w:val="18"/>
+                <w:szCs w:val="18"/>
+              </w:rPr>
+              <w:t xml:space="preserve"> index comparison.</w:t>
+            </w:r>
+          </w:p>
+          <w:p>
+            <w:pPr>
+              <w:rPr>
+                <w:sz w:val="18"/>
+                <w:szCs w:val="18"/>
+              </w:rPr>
+            </w:pPr>
+            <w:r>
+              <w:rPr>
+                <w:sz w:val="18"/>
+                <w:szCs w:val="18"/>
+              </w:rPr>
+              <w:t xml:space="preserve">  - Comparison report Summary tab updated: shows all 6 statuses (NEW, RENEWAL,</w:t>
+            </w:r>
+          </w:p>
+          <w:p>
+            <w:pPr>
+              <w:rPr>
+                <w:sz w:val="18"/>
+                <w:szCs w:val="18"/>
+              </w:rPr>
+            </w:pPr>
+            <w:r>
+              <w:rPr>
+                <w:sz w:val="18"/>
+                <w:szCs w:val="18"/>
+              </w:rPr>
+              <w:t xml:space="preserve">    CHANGED, SAME, SKIPPED, DROPPED) with color coding and Action Required column.</w:t>
+            </w:r>
+          </w:p>
+          <w:p>
+            <w:pPr>
+              <w:rPr>
+                <w:sz w:val="18"/>
+                <w:szCs w:val="18"/>
+              </w:rPr>
+            </w:pPr>
+            <w:r>
+              <w:rPr>
+                <w:sz w:val="18"/>
+                <w:szCs w:val="18"/>
+              </w:rPr>
+              <w:t xml:space="preserve">  - Comparison report: added Renewals and Dropped tabs alongside Detail/Changed.</w:t>
+            </w:r>
+          </w:p>
+          <w:p>
+            <w:pPr>
+              <w:rPr>
+                <w:sz w:val="18"/>
+                <w:szCs w:val="18"/>
+              </w:rPr>
+            </w:pPr>
+            <w:r>
+              <w:rPr>
+                <w:sz w:val="18"/>
+                <w:szCs w:val="18"/>
+              </w:rPr>
+              <w:t xml:space="preserve">  - Removed: </w:t>
+            </w:r>
+            <w:proofErr w:type="spellStart"/>
+            <w:r>
+              <w:rPr>
+                <w:sz w:val="18"/>
+                <w:szCs w:val="18"/>
+              </w:rPr>
+              <w:t>is_active</w:t>
+            </w:r>
+            <w:proofErr w:type="spellEnd"/>
+            <w:r>
+              <w:rPr>
+                <w:sz w:val="18"/>
+                <w:szCs w:val="18"/>
+              </w:rPr>
+              <w:t xml:space="preserve">, </w:t>
+            </w:r>
+            <w:proofErr w:type="spellStart"/>
+            <w:r>
+              <w:rPr>
+                <w:sz w:val="18"/>
+                <w:szCs w:val="18"/>
+              </w:rPr>
+              <w:t>new_expired</w:t>
+            </w:r>
+            <w:proofErr w:type="spellEnd"/>
+            <w:r>
+              <w:rPr>
+                <w:sz w:val="18"/>
+                <w:szCs w:val="18"/>
+              </w:rPr>
+              <w:t xml:space="preserve">, </w:t>
+            </w:r>
+            <w:proofErr w:type="spellStart"/>
+            <w:r>
+              <w:rPr>
+                <w:sz w:val="18"/>
+                <w:szCs w:val="18"/>
+              </w:rPr>
+              <w:t>expiry_passed</w:t>
+            </w:r>
+            <w:proofErr w:type="spellEnd"/>
+            <w:r>
+              <w:rPr>
+                <w:sz w:val="18"/>
+                <w:szCs w:val="18"/>
+              </w:rPr>
+              <w:t xml:space="preserve">, </w:t>
+            </w:r>
+            <w:proofErr w:type="spellStart"/>
+            <w:r>
+              <w:rPr>
+                <w:sz w:val="18"/>
+                <w:szCs w:val="18"/>
+              </w:rPr>
+              <w:t>membership_triggered</w:t>
+            </w:r>
+            <w:proofErr w:type="spellEnd"/>
+            <w:r>
+              <w:rPr>
+                <w:sz w:val="18"/>
+                <w:szCs w:val="18"/>
+              </w:rPr>
+              <w:t xml:space="preserve"> logic.</w:t>
+            </w:r>
+          </w:p>
+          <w:p>
+            <w:pPr>
+              <w:rPr>
+                <w:sz w:val="18"/>
+                <w:szCs w:val="18"/>
+              </w:rPr>
+            </w:pPr>
+            <w:r>
+              <w:rPr>
+                <w:sz w:val="18"/>
+                <w:szCs w:val="18"/>
+              </w:rPr>
+              <w:lastRenderedPageBreak/>
+              <w:t xml:space="preserve">  - Notification email updated to reflect new 6-file output and action steps.</w:t>
+            </w:r>
+          </w:p>
+        </w:tc>
+      </w:tr>
+      <w:tr>
+        <w:tc>
+          <w:tcPr>
+            <w:tcW w:w="1080" w:type="dxa"/>
+            <w:tcBorders>
+              <w:top w:val="single" w:sz="1" w:space="0" w:color="CCCCCC"/>
+              <w:left w:val="single" w:sz="1" w:space="0" w:color="CCCCCC"/>
+              <w:bottom w:val="single" w:sz="1" w:space="0" w:color="CCCCCC"/>
+              <w:right w:val="single" w:sz="1" w:space="0" w:color="CCCCCC"/>
+            </w:tcBorders>
+            <w:shd w:val="clear" w:color="auto" w:fill="FFFFFF"/>
+            <w:tcMar>
+              <w:top w:w="80" w:type="dxa"/>
+              <w:left w:w="120" w:type="dxa"/>
+              <w:bottom w:w="80" w:type="dxa"/>
+              <w:right w:w="120" w:type="dxa"/>
+            </w:tcMar>
+          </w:tcPr>
+          <w:p>
+            <w:pPr>
+              <w:rPr>
+                <w:sz w:val="18"/>
+                <w:szCs w:val="18"/>
+              </w:rPr>
+            </w:pPr>
+            <w:r>
+              <w:rPr>
+                <w:sz w:val="18"/>
+                <w:szCs w:val="18"/>
+              </w:rPr>
+              <w:lastRenderedPageBreak/>
+              <w:t>2.1.1</w:t>
+            </w:r>
+          </w:p>
+        </w:tc>
+        <w:tc>
+          <w:tcPr>
+            <w:tcW w:w="8280" w:type="dxa"/>
+            <w:tcBorders>
+              <w:top w:val="single" w:sz="1" w:space="0" w:color="CCCCCC"/>
+              <w:left w:val="single" w:sz="1" w:space="0" w:color="CCCCCC"/>
+              <w:bottom w:val="single" w:sz="1" w:space="0" w:color="CCCCCC"/>
+              <w:right w:val="single" w:sz="1" w:space="0" w:color="CCCCCC"/>
+            </w:tcBorders>
+            <w:shd w:val="clear" w:color="auto" w:fill="FFFFFF"/>
+            <w:tcMar>
+              <w:top w:w="80" w:type="dxa"/>
+              <w:left w:w="120" w:type="dxa"/>
+              <w:bottom w:w="80" w:type="dxa"/>
+              <w:right w:w="120" w:type="dxa"/>
+            </w:tcMar>
+          </w:tcPr>
+          <w:p>
+            <w:pPr>
+              <w:rPr>
+                <w:sz w:val="18"/>
+                <w:szCs w:val="18"/>
+              </w:rPr>
+            </w:pPr>
+            <w:r>
+              <w:rPr>
+                <w:sz w:val="18"/>
+                <w:szCs w:val="18"/>
+              </w:rPr>
+              <w:t xml:space="preserve">  - </w:t>
+            </w:r>
+            <w:proofErr w:type="spellStart"/>
+            <w:r>
+              <w:rPr>
+                <w:sz w:val="18"/>
+                <w:szCs w:val="18"/>
+              </w:rPr>
+              <w:t>build_membership_row</w:t>
+            </w:r>
+            <w:proofErr w:type="spellEnd"/>
+            <w:r>
+              <w:rPr>
+                <w:sz w:val="18"/>
+                <w:szCs w:val="18"/>
+              </w:rPr>
+              <w:t>: "Membership End Date" now set to 10 years from</w:t>
+            </w:r>
+          </w:p>
+          <w:p>
+            <w:pPr>
+              <w:rPr>
+                <w:sz w:val="18"/>
+                <w:szCs w:val="18"/>
+              </w:rPr>
+            </w:pPr>
+            <w:r>
+              <w:rPr>
+                <w:sz w:val="18"/>
+                <w:szCs w:val="18"/>
+              </w:rPr>
+              <w:t xml:space="preserve">    run date (matching </w:t>
+            </w:r>
+            <w:proofErr w:type="spellStart"/>
+            <w:r>
+              <w:rPr>
+                <w:sz w:val="18"/>
+                <w:szCs w:val="18"/>
+              </w:rPr>
+              <w:t>GlueUp's</w:t>
+            </w:r>
+            <w:proofErr w:type="spellEnd"/>
+            <w:r>
+              <w:rPr>
+                <w:sz w:val="18"/>
+                <w:szCs w:val="18"/>
+              </w:rPr>
+              <w:t xml:space="preserve"> new 10-year membership term configuration)</w:t>
+            </w:r>
+          </w:p>
+          <w:p>
+            <w:pPr>
+              <w:rPr>
+                <w:sz w:val="18"/>
+                <w:szCs w:val="18"/>
+              </w:rPr>
+            </w:pPr>
+            <w:r>
+              <w:rPr>
+                <w:sz w:val="18"/>
+                <w:szCs w:val="18"/>
+              </w:rPr>
+              <w:t xml:space="preserve">    instead of the ICF Global expiry date. "ICF Global Membership End Date"</w:t>
+            </w:r>
+          </w:p>
+          <w:p>
+            <w:pPr>
+              <w:rPr>
+                <w:sz w:val="18"/>
+                <w:szCs w:val="18"/>
+              </w:rPr>
+            </w:pPr>
+            <w:r>
+              <w:rPr>
+                <w:sz w:val="18"/>
+                <w:szCs w:val="18"/>
+              </w:rPr>
+              <w:t xml:space="preserve">    continues to reflect the actual ICF expiry date.</w:t>
             </w:r>
           </w:p>
         </w:tc>
@@ -23224,8 +24365,8 @@
     </w:tbl>
     <w:p/>
     <w:sectPr>
-      <w:headerReference w:type="default" r:id="rId7"/>
-      <w:footerReference w:type="default" r:id="rId8"/>
+      <w:headerReference w:type="default" r:id="rId8"/>
+      <w:footerReference w:type="default" r:id="rId9"/>
       <w:pgSz w:w="12240" w:h="15840"/>
       <w:pgMar w:top="1080" w:right="1080" w:bottom="1080" w:left="1080" w:header="708" w:footer="708" w:gutter="0"/>
       <w:cols w:space="720"/>
@@ -24190,7 +25331,6 @@
   <w:style w:type="character" w:default="1" w:styleId="DefaultParagraphFont">
     <w:name w:val="Default Paragraph Font"/>
     <w:uiPriority w:val="1"/>
-    <w:semiHidden/>
     <w:unhideWhenUsed/>
   </w:style>
   <w:style w:type="table" w:default="1" w:styleId="TableNormal">

</xml_diff>

<commit_message>
v2.2.0 corrected renewal logic
</commit_message>
<xml_diff>
--- a/docs/GlobalGlueUpSync_Design_Spec.docx
+++ b/docs/GlobalGlueUpSync_Design_Spec.docx
@@ -44,7 +44,46 @@
           <w:i/>
           <w:iCs/>
         </w:rPr>
-        <w:t>Design Specification  |  Version 1.21  |  June 2026</w:t>
+        <w:t xml:space="preserve">Design </w:t>
+      </w:r>
+      <w:proofErr w:type="gramStart"/>
+      <w:r>
+        <w:rPr>
+          <w:i/>
+          <w:iCs/>
+        </w:rPr>
+        <w:t>Specification  |</w:t>
+      </w:r>
+      <w:proofErr w:type="gramEnd"/>
+      <w:r>
+        <w:rPr>
+          <w:i/>
+          <w:iCs/>
+        </w:rPr>
+        <w:t xml:space="preserve">  Version </w:t>
+      </w:r>
+      <w:proofErr w:type="gramStart"/>
+      <w:r>
+        <w:rPr>
+          <w:i/>
+          <w:iCs/>
+        </w:rPr>
+        <w:t>2.2.0</w:t>
+      </w:r>
+      <w:r>
+        <w:rPr>
+          <w:i/>
+          <w:iCs/>
+        </w:rPr>
+        <w:t xml:space="preserve">  |</w:t>
+      </w:r>
+      <w:proofErr w:type="gramEnd"/>
+      <w:r>
+        <w:rPr>
+          <w:i/>
+          <w:iCs/>
+        </w:rPr>
+        <w:t xml:space="preserve">  June 2026</w:t>
       </w:r>
     </w:p>
     <w:p>
@@ -182,12 +221,18 @@
             </w:tcMar>
           </w:tcPr>
           <w:p>
-            <w:r>
-              <w:rPr>
-                <w:sz w:val="18"/>
-                <w:szCs w:val="18"/>
-              </w:rPr>
-              <w:t>1.21</w:t>
+            <w:pPr>
+              <w:rPr>
+                <w:sz w:val="18"/>
+                <w:szCs w:val="18"/>
+              </w:rPr>
+            </w:pPr>
+            <w:r>
+              <w:rPr>
+                <w:sz w:val="18"/>
+                <w:szCs w:val="18"/>
+              </w:rPr>
+              <w:t>2.2.0</w:t>
             </w:r>
           </w:p>
         </w:tc>
@@ -9946,15 +9991,7 @@
               <w:right w:w="120" w:type="dxa"/>
             </w:tcMar>
           </w:tcPr>
-          <w:p>
-            <w:r>
-              <w:rPr>
-                <w:sz w:val="18"/>
-                <w:szCs w:val="18"/>
-              </w:rPr>
-              <w:t>(blank — belongs to Membership import)</w:t>
-            </w:r>
-          </w:p>
+          <w:p/>
         </w:tc>
         <w:tc>
           <w:tcPr>
@@ -9979,7 +10016,7 @@
                 <w:sz w:val="18"/>
                 <w:szCs w:val="18"/>
               </w:rPr>
-              <w:t>No — ignored</w:t>
+              <w:t>Yes</w:t>
             </w:r>
           </w:p>
         </w:tc>
@@ -15587,7 +15624,7 @@
         </w:trPr>
         <w:tc>
           <w:tcPr>
-            <w:tcW w:w="500" w:type="dxa"/>
+            <w:tcW w:w="631" w:type="dxa"/>
             <w:tcBorders>
               <w:top w:val="single" w:sz="1" w:space="0" w:color="CCCCCC"/>
               <w:left w:val="single" w:sz="1" w:space="0" w:color="CCCCCC"/>
@@ -15616,7 +15653,7 @@
         </w:tc>
         <w:tc>
           <w:tcPr>
-            <w:tcW w:w="8860" w:type="dxa"/>
+            <w:tcW w:w="8729" w:type="dxa"/>
             <w:tcBorders>
               <w:top w:val="single" w:sz="1" w:space="0" w:color="CCCCCC"/>
               <w:left w:val="single" w:sz="1" w:space="0" w:color="CCCCCC"/>
@@ -15647,7 +15684,7 @@
       <w:tr>
         <w:tc>
           <w:tcPr>
-            <w:tcW w:w="500" w:type="dxa"/>
+            <w:tcW w:w="631" w:type="dxa"/>
             <w:tcBorders>
               <w:top w:val="single" w:sz="1" w:space="0" w:color="CCCCCC"/>
               <w:left w:val="single" w:sz="1" w:space="0" w:color="CCCCCC"/>
@@ -15674,7 +15711,7 @@
         </w:tc>
         <w:tc>
           <w:tcPr>
-            <w:tcW w:w="8860" w:type="dxa"/>
+            <w:tcW w:w="8729" w:type="dxa"/>
             <w:tcBorders>
               <w:top w:val="single" w:sz="1" w:space="0" w:color="CCCCCC"/>
               <w:left w:val="single" w:sz="1" w:space="0" w:color="CCCCCC"/>
@@ -15703,7 +15740,7 @@
       <w:tr>
         <w:tc>
           <w:tcPr>
-            <w:tcW w:w="500" w:type="dxa"/>
+            <w:tcW w:w="631" w:type="dxa"/>
             <w:tcBorders>
               <w:top w:val="single" w:sz="1" w:space="0" w:color="CCCCCC"/>
               <w:left w:val="single" w:sz="1" w:space="0" w:color="CCCCCC"/>
@@ -15730,7 +15767,7 @@
         </w:tc>
         <w:tc>
           <w:tcPr>
-            <w:tcW w:w="8860" w:type="dxa"/>
+            <w:tcW w:w="8729" w:type="dxa"/>
             <w:tcBorders>
               <w:top w:val="single" w:sz="1" w:space="0" w:color="CCCCCC"/>
               <w:left w:val="single" w:sz="1" w:space="0" w:color="CCCCCC"/>
@@ -15759,7 +15796,7 @@
       <w:tr>
         <w:tc>
           <w:tcPr>
-            <w:tcW w:w="500" w:type="dxa"/>
+            <w:tcW w:w="631" w:type="dxa"/>
             <w:tcBorders>
               <w:top w:val="single" w:sz="1" w:space="0" w:color="CCCCCC"/>
               <w:left w:val="single" w:sz="1" w:space="0" w:color="CCCCCC"/>
@@ -15786,7 +15823,7 @@
         </w:tc>
         <w:tc>
           <w:tcPr>
-            <w:tcW w:w="8860" w:type="dxa"/>
+            <w:tcW w:w="8729" w:type="dxa"/>
             <w:tcBorders>
               <w:top w:val="single" w:sz="1" w:space="0" w:color="CCCCCC"/>
               <w:left w:val="single" w:sz="1" w:space="0" w:color="CCCCCC"/>
@@ -15815,7 +15852,7 @@
       <w:tr>
         <w:tc>
           <w:tcPr>
-            <w:tcW w:w="500" w:type="dxa"/>
+            <w:tcW w:w="631" w:type="dxa"/>
             <w:tcBorders>
               <w:top w:val="single" w:sz="1" w:space="0" w:color="CCCCCC"/>
               <w:left w:val="single" w:sz="1" w:space="0" w:color="CCCCCC"/>
@@ -15842,7 +15879,7 @@
         </w:tc>
         <w:tc>
           <w:tcPr>
-            <w:tcW w:w="8860" w:type="dxa"/>
+            <w:tcW w:w="8729" w:type="dxa"/>
             <w:tcBorders>
               <w:top w:val="single" w:sz="1" w:space="0" w:color="CCCCCC"/>
               <w:left w:val="single" w:sz="1" w:space="0" w:color="CCCCCC"/>
@@ -15871,7 +15908,7 @@
       <w:tr>
         <w:tc>
           <w:tcPr>
-            <w:tcW w:w="500" w:type="dxa"/>
+            <w:tcW w:w="631" w:type="dxa"/>
             <w:tcBorders>
               <w:top w:val="single" w:sz="1" w:space="0" w:color="CCCCCC"/>
               <w:left w:val="single" w:sz="1" w:space="0" w:color="CCCCCC"/>
@@ -15899,7 +15936,7 @@
         </w:tc>
         <w:tc>
           <w:tcPr>
-            <w:tcW w:w="8860" w:type="dxa"/>
+            <w:tcW w:w="8729" w:type="dxa"/>
             <w:tcBorders>
               <w:top w:val="single" w:sz="1" w:space="0" w:color="CCCCCC"/>
               <w:left w:val="single" w:sz="1" w:space="0" w:color="CCCCCC"/>
@@ -15928,7 +15965,7 @@
       <w:tr>
         <w:tc>
           <w:tcPr>
-            <w:tcW w:w="500" w:type="dxa"/>
+            <w:tcW w:w="631" w:type="dxa"/>
             <w:tcBorders>
               <w:top w:val="single" w:sz="1" w:space="0" w:color="CCCCCC"/>
               <w:left w:val="single" w:sz="1" w:space="0" w:color="CCCCCC"/>
@@ -15955,7 +15992,7 @@
         </w:tc>
         <w:tc>
           <w:tcPr>
-            <w:tcW w:w="8860" w:type="dxa"/>
+            <w:tcW w:w="8729" w:type="dxa"/>
             <w:tcBorders>
               <w:top w:val="single" w:sz="1" w:space="0" w:color="CCCCCC"/>
               <w:left w:val="single" w:sz="1" w:space="0" w:color="CCCCCC"/>
@@ -15984,7 +16021,7 @@
       <w:tr>
         <w:tc>
           <w:tcPr>
-            <w:tcW w:w="500" w:type="dxa"/>
+            <w:tcW w:w="631" w:type="dxa"/>
             <w:tcBorders>
               <w:top w:val="single" w:sz="1" w:space="0" w:color="CCCCCC"/>
               <w:left w:val="single" w:sz="1" w:space="0" w:color="CCCCCC"/>
@@ -16011,7 +16048,7 @@
         </w:tc>
         <w:tc>
           <w:tcPr>
-            <w:tcW w:w="8860" w:type="dxa"/>
+            <w:tcW w:w="8729" w:type="dxa"/>
             <w:tcBorders>
               <w:top w:val="single" w:sz="1" w:space="0" w:color="CCCCCC"/>
               <w:left w:val="single" w:sz="1" w:space="0" w:color="CCCCCC"/>
@@ -16040,7 +16077,7 @@
       <w:tr>
         <w:tc>
           <w:tcPr>
-            <w:tcW w:w="500" w:type="dxa"/>
+            <w:tcW w:w="631" w:type="dxa"/>
             <w:tcBorders>
               <w:top w:val="single" w:sz="1" w:space="0" w:color="CCCCCC"/>
               <w:left w:val="single" w:sz="1" w:space="0" w:color="CCCCCC"/>
@@ -16067,28 +16104,42 @@
         </w:tc>
         <w:tc>
           <w:tcPr>
-            <w:tcW w:w="8860" w:type="dxa"/>
-            <w:tcBorders>
-              <w:top w:val="single" w:sz="1" w:space="0" w:color="CCCCCC"/>
-              <w:left w:val="single" w:sz="1" w:space="0" w:color="CCCCCC"/>
-              <w:bottom w:val="single" w:sz="1" w:space="0" w:color="CCCCCC"/>
-              <w:right w:val="single" w:sz="1" w:space="0" w:color="CCCCCC"/>
-            </w:tcBorders>
-            <w:shd w:val="clear" w:color="auto" w:fill="FFFFFF"/>
-            <w:tcMar>
-              <w:top w:w="80" w:type="dxa"/>
-              <w:left w:w="120" w:type="dxa"/>
-              <w:bottom w:w="80" w:type="dxa"/>
-              <w:right w:w="120" w:type="dxa"/>
-            </w:tcMar>
-          </w:tcPr>
-          <w:p>
-            <w:r>
-              <w:rPr>
-                <w:sz w:val="18"/>
-                <w:szCs w:val="18"/>
-              </w:rPr>
-              <w:t>Contact import: include row if NEW or CHANGED.</w:t>
+            <w:tcW w:w="8729" w:type="dxa"/>
+            <w:tcBorders>
+              <w:top w:val="single" w:sz="1" w:space="0" w:color="CCCCCC"/>
+              <w:left w:val="single" w:sz="1" w:space="0" w:color="CCCCCC"/>
+              <w:bottom w:val="single" w:sz="1" w:space="0" w:color="CCCCCC"/>
+              <w:right w:val="single" w:sz="1" w:space="0" w:color="CCCCCC"/>
+            </w:tcBorders>
+            <w:shd w:val="clear" w:color="auto" w:fill="FFFFFF"/>
+            <w:tcMar>
+              <w:top w:w="80" w:type="dxa"/>
+              <w:left w:w="120" w:type="dxa"/>
+              <w:bottom w:w="80" w:type="dxa"/>
+              <w:right w:w="120" w:type="dxa"/>
+            </w:tcMar>
+          </w:tcPr>
+          <w:p>
+            <w:r>
+              <w:rPr>
+                <w:sz w:val="18"/>
+                <w:szCs w:val="18"/>
+              </w:rPr>
+              <w:t>Contact import: include row if NEW or CHANGED</w:t>
+            </w:r>
+            <w:r>
+              <w:rPr>
+                <w:sz w:val="18"/>
+                <w:szCs w:val="18"/>
+              </w:rPr>
+              <w:t xml:space="preserve"> or RENEWAL</w:t>
+            </w:r>
+            <w:r>
+              <w:rPr>
+                <w:sz w:val="18"/>
+                <w:szCs w:val="18"/>
+              </w:rPr>
+              <w:t>.</w:t>
             </w:r>
           </w:p>
         </w:tc>
@@ -16096,7 +16147,7 @@
       <w:tr>
         <w:tc>
           <w:tcPr>
-            <w:tcW w:w="500" w:type="dxa"/>
+            <w:tcW w:w="631" w:type="dxa"/>
             <w:tcBorders>
               <w:top w:val="single" w:sz="1" w:space="0" w:color="CCCCCC"/>
               <w:left w:val="single" w:sz="1" w:space="0" w:color="CCCCCC"/>
@@ -16123,7 +16174,7 @@
         </w:tc>
         <w:tc>
           <w:tcPr>
-            <w:tcW w:w="8860" w:type="dxa"/>
+            <w:tcW w:w="8729" w:type="dxa"/>
             <w:tcBorders>
               <w:top w:val="single" w:sz="1" w:space="0" w:color="CCCCCC"/>
               <w:left w:val="single" w:sz="1" w:space="0" w:color="CCCCCC"/>
@@ -16152,63 +16203,7 @@
       <w:tr>
         <w:tc>
           <w:tcPr>
-            <w:tcW w:w="500" w:type="dxa"/>
-            <w:tcBorders>
-              <w:top w:val="single" w:sz="1" w:space="0" w:color="CCCCCC"/>
-              <w:left w:val="single" w:sz="1" w:space="0" w:color="CCCCCC"/>
-              <w:bottom w:val="single" w:sz="1" w:space="0" w:color="CCCCCC"/>
-              <w:right w:val="single" w:sz="1" w:space="0" w:color="CCCCCC"/>
-            </w:tcBorders>
-            <w:shd w:val="clear" w:color="auto" w:fill="FFFFFF"/>
-            <w:tcMar>
-              <w:top w:w="80" w:type="dxa"/>
-              <w:left w:w="120" w:type="dxa"/>
-              <w:bottom w:w="80" w:type="dxa"/>
-              <w:right w:w="120" w:type="dxa"/>
-            </w:tcMar>
-          </w:tcPr>
-          <w:p>
-            <w:r>
-              <w:rPr>
-                <w:sz w:val="18"/>
-                <w:szCs w:val="18"/>
-              </w:rPr>
-              <w:t>8c</w:t>
-            </w:r>
-          </w:p>
-        </w:tc>
-        <w:tc>
-          <w:tcPr>
-            <w:tcW w:w="8860" w:type="dxa"/>
-            <w:tcBorders>
-              <w:top w:val="single" w:sz="1" w:space="0" w:color="CCCCCC"/>
-              <w:left w:val="single" w:sz="1" w:space="0" w:color="CCCCCC"/>
-              <w:bottom w:val="single" w:sz="1" w:space="0" w:color="CCCCCC"/>
-              <w:right w:val="single" w:sz="1" w:space="0" w:color="CCCCCC"/>
-            </w:tcBorders>
-            <w:shd w:val="clear" w:color="auto" w:fill="FFFFFF"/>
-            <w:tcMar>
-              <w:top w:w="80" w:type="dxa"/>
-              <w:left w:w="120" w:type="dxa"/>
-              <w:bottom w:w="80" w:type="dxa"/>
-              <w:right w:w="120" w:type="dxa"/>
-            </w:tcMar>
-          </w:tcPr>
-          <w:p>
-            <w:r>
-              <w:rPr>
-                <w:sz w:val="18"/>
-                <w:szCs w:val="18"/>
-              </w:rPr>
-              <w:t>RENEWAL (CHANGED where ICF expiry has advanced): contact import + renewals_*.xlsx worklist for manual GlueUp UI update. No membership import row. CHANGED (other fields): contact import only.</w:t>
-            </w:r>
-          </w:p>
-        </w:tc>
-      </w:tr>
-      <w:tr>
-        <w:tc>
-          <w:tcPr>
-            <w:tcW w:w="500" w:type="dxa"/>
+            <w:tcW w:w="631" w:type="dxa"/>
             <w:tcBorders>
               <w:top w:val="single" w:sz="1" w:space="0" w:color="CCCCCC"/>
               <w:left w:val="single" w:sz="1" w:space="0" w:color="CCCCCC"/>
@@ -16235,7 +16230,7 @@
         </w:tc>
         <w:tc>
           <w:tcPr>
-            <w:tcW w:w="8860" w:type="dxa"/>
+            <w:tcW w:w="8729" w:type="dxa"/>
             <w:tcBorders>
               <w:top w:val="single" w:sz="1" w:space="0" w:color="CCCCCC"/>
               <w:left w:val="single" w:sz="1" w:space="0" w:color="CCCCCC"/>
@@ -17218,7 +17213,6 @@
         <w:pStyle w:val="Heading1"/>
       </w:pPr>
       <w:r>
-        <w:lastRenderedPageBreak/>
         <w:t>7. Operational Workflow</w:t>
       </w:r>
     </w:p>
@@ -17273,6 +17267,7 @@
                 <w:sz w:val="18"/>
                 <w:szCs w:val="18"/>
               </w:rPr>
+              <w:lastRenderedPageBreak/>
               <w:t>Step</w:t>
             </w:r>
           </w:p>
@@ -19394,7 +19389,7 @@
                 <w:sz w:val="18"/>
                 <w:szCs w:val="18"/>
               </w:rPr>
-              <w:t>All seven output files: contact_import, membership_import, renewals, dropped_members, comparison_report, duplicate_report, run_log.</w:t>
+              <w:t>All seven output files: contact_import, membership_import, dropped_members, comparison_report, duplicate_report, run_log.</w:t>
             </w:r>
           </w:p>
         </w:tc>
@@ -22965,7 +22960,37 @@
                 <w:sz w:val="18"/>
                 <w:szCs w:val="18"/>
               </w:rPr>
-              <w:t>Redesigned sync logic. Make scenario row filter removed — ICF Global API now correctly returns only active members. Sync statuses: NEW (contact + membership import), RENEWAL (contact import + renewals_*.xlsx for manual GlueUp UI update), CHANGED (contact import only), DROPPED (dropped_members_*.xlsx for manual membership cancellation). Membership import restricted to NEW members only — renewals no longer imported via membership import to prevent duplicate membership records. Membership End Date in import set to 10 years from run date (GlueUp membership term reconfigured to 10 years to disable auto-renewal). Two new output files: renewals_*.xlsx and dropped_members_*.xlsx. Comparison report updated: six statuses with colour coding and Action Required column; new Renewals and Dropped tabs. Notification email updated to reflect new 7-file output and action steps. Removed: is_active, new_expired, expiry_passed, membership_triggered logic. Script version: 2.1.1. Utility script FindAutoRenewed.py added to identify members whose membership.endDate was auto-advanced by GlueUp before the 10-year term change.</w:t>
+              <w:t xml:space="preserve">Redesigned sync logic. Make scenario row filter removed — ICF Global API now correctly returns only active members. Sync statuses: NEW (contact + membership import), RENEWAL (contact import), CHANGED (contact import only), DROPPED (dropped_members_*.xlsx for manual membership cancellation). Membership import restricted to NEW members only — renewals no longer imported via membership import to prevent duplicate membership records. Membership End Date in import set to 10 years from run date (GlueUp membership term reconfigured to 10 years to disable auto-renewal). </w:t>
+            </w:r>
+            <w:r>
+              <w:rPr>
+                <w:sz w:val="18"/>
+                <w:szCs w:val="18"/>
+              </w:rPr>
+              <w:t>One</w:t>
+            </w:r>
+            <w:r>
+              <w:rPr>
+                <w:sz w:val="18"/>
+                <w:szCs w:val="18"/>
+              </w:rPr>
+              <w:t xml:space="preserve"> new output </w:t>
+            </w:r>
+            <w:proofErr w:type="gramStart"/>
+            <w:r>
+              <w:rPr>
+                <w:sz w:val="18"/>
+                <w:szCs w:val="18"/>
+              </w:rPr>
+              <w:t>files</w:t>
+            </w:r>
+            <w:proofErr w:type="gramEnd"/>
+            <w:r>
+              <w:rPr>
+                <w:sz w:val="18"/>
+                <w:szCs w:val="18"/>
+              </w:rPr>
+              <w:t>: renewals_*.xlsx and dropped_members_*.xlsx. Comparison report updated: six statuses with colour coding and Action Required column; new Renewals and Dropped tabs. Notification email updated to reflect new 7-file output and action steps. Removed: is_active, new_expired, expiry_passed, membership_triggered logic. Script version: 2.1.1. Utility script FindAutoRenewed.py added to identify members whose membership.endDate was auto-advanced by GlueUp before the 10-year term change.</w:t>
             </w:r>
           </w:p>
         </w:tc>
@@ -23101,15 +23126,7 @@
                 <w:sz w:val="18"/>
                 <w:szCs w:val="18"/>
               </w:rPr>
-              <w:t xml:space="preserve">  - Cloud Run migration: replaced OAuth 2.0 browser flow in _</w:t>
-            </w:r>
-            <w:proofErr w:type="spellStart"/>
-            <w:r>
-              <w:rPr>
-                <w:sz w:val="18"/>
-                <w:szCs w:val="18"/>
-              </w:rPr>
-              <w:t>get_drive_</w:t>
+              <w:t xml:space="preserve">  - Cloud Run migration: replaced OAuth 2.0 browser flow in _get_drive_</w:t>
             </w:r>
             <w:proofErr w:type="gramStart"/>
             <w:r>
@@ -23117,15 +23134,7 @@
                 <w:sz w:val="18"/>
                 <w:szCs w:val="18"/>
               </w:rPr>
-              <w:t>service</w:t>
-            </w:r>
-            <w:proofErr w:type="spellEnd"/>
-            <w:r>
-              <w:rPr>
-                <w:sz w:val="18"/>
-                <w:szCs w:val="18"/>
-              </w:rPr>
-              <w:t>(</w:t>
+              <w:t>service(</w:t>
             </w:r>
             <w:proofErr w:type="gramEnd"/>
             <w:r>
@@ -23163,23 +23172,7 @@
                 <w:sz w:val="18"/>
                 <w:szCs w:val="18"/>
               </w:rPr>
-              <w:t xml:space="preserve">    supplies credentials automatically; locally use '</w:t>
-            </w:r>
-            <w:proofErr w:type="spellStart"/>
-            <w:r>
-              <w:rPr>
-                <w:sz w:val="18"/>
-                <w:szCs w:val="18"/>
-              </w:rPr>
-              <w:t>gcloud</w:t>
-            </w:r>
-            <w:proofErr w:type="spellEnd"/>
-            <w:r>
-              <w:rPr>
-                <w:sz w:val="18"/>
-                <w:szCs w:val="18"/>
-              </w:rPr>
-              <w:t xml:space="preserve"> auth application-default login'.</w:t>
+              <w:t xml:space="preserve">    supplies credentials automatically; locally use 'gcloud auth application-default login'.</w:t>
             </w:r>
           </w:p>
           <w:p>
@@ -23194,31 +23187,7 @@
                 <w:sz w:val="18"/>
                 <w:szCs w:val="18"/>
               </w:rPr>
-              <w:t xml:space="preserve">  - </w:t>
-            </w:r>
-            <w:proofErr w:type="spellStart"/>
-            <w:r>
-              <w:rPr>
-                <w:sz w:val="18"/>
-                <w:szCs w:val="18"/>
-              </w:rPr>
-              <w:t>GlueUp</w:t>
-            </w:r>
-            <w:proofErr w:type="spellEnd"/>
-            <w:r>
-              <w:rPr>
-                <w:sz w:val="18"/>
-                <w:szCs w:val="18"/>
-              </w:rPr>
-              <w:t xml:space="preserve"> auth: replaced token-file approach (</w:t>
-            </w:r>
-            <w:proofErr w:type="spellStart"/>
-            <w:r>
-              <w:rPr>
-                <w:sz w:val="18"/>
-                <w:szCs w:val="18"/>
-              </w:rPr>
-              <w:t>glueup_</w:t>
+              <w:t xml:space="preserve">  - GlueUp auth: replaced token-file approach (glueup_</w:t>
             </w:r>
             <w:proofErr w:type="gramStart"/>
             <w:r>
@@ -23228,7 +23197,6 @@
               </w:rPr>
               <w:t>token.json</w:t>
             </w:r>
-            <w:proofErr w:type="spellEnd"/>
             <w:proofErr w:type="gramEnd"/>
             <w:r>
               <w:rPr>
@@ -23250,15 +23218,7 @@
                 <w:sz w:val="18"/>
                 <w:szCs w:val="18"/>
               </w:rPr>
-              <w:t xml:space="preserve">    HMAC-SHA256 authentication. </w:t>
-            </w:r>
-            <w:proofErr w:type="spellStart"/>
-            <w:r>
-              <w:rPr>
-                <w:sz w:val="18"/>
-                <w:szCs w:val="18"/>
-              </w:rPr>
-              <w:t>glueup_</w:t>
+              <w:t xml:space="preserve">    HMAC-SHA256 authentication. glueup_</w:t>
             </w:r>
             <w:proofErr w:type="gramStart"/>
             <w:r>
@@ -23266,15 +23226,7 @@
                 <w:sz w:val="18"/>
                 <w:szCs w:val="18"/>
               </w:rPr>
-              <w:t>auth</w:t>
-            </w:r>
-            <w:proofErr w:type="spellEnd"/>
-            <w:r>
-              <w:rPr>
-                <w:sz w:val="18"/>
-                <w:szCs w:val="18"/>
-              </w:rPr>
-              <w:t>(</w:t>
+              <w:t>auth(</w:t>
             </w:r>
             <w:proofErr w:type="gramEnd"/>
             <w:r>
@@ -23282,23 +23234,7 @@
                 <w:sz w:val="18"/>
                 <w:szCs w:val="18"/>
               </w:rPr>
-              <w:t xml:space="preserve">) now calls the </w:t>
-            </w:r>
-            <w:proofErr w:type="spellStart"/>
-            <w:r>
-              <w:rPr>
-                <w:sz w:val="18"/>
-                <w:szCs w:val="18"/>
-              </w:rPr>
-              <w:t>GlueUp</w:t>
-            </w:r>
-            <w:proofErr w:type="spellEnd"/>
-            <w:r>
-              <w:rPr>
-                <w:sz w:val="18"/>
-                <w:szCs w:val="18"/>
-              </w:rPr>
-              <w:t xml:space="preserve"> session</w:t>
+              <w:t>) now calls the GlueUp session</w:t>
             </w:r>
           </w:p>
           <w:p>
@@ -23328,15 +23264,7 @@
                 <w:sz w:val="18"/>
                 <w:szCs w:val="18"/>
               </w:rPr>
-              <w:t xml:space="preserve">  - Secret Manager: added _</w:t>
-            </w:r>
-            <w:proofErr w:type="spellStart"/>
-            <w:r>
-              <w:rPr>
-                <w:sz w:val="18"/>
-                <w:szCs w:val="18"/>
-              </w:rPr>
-              <w:t>load_secrets_from_secret_</w:t>
+              <w:t xml:space="preserve">  - Secret Manager: added _load_secrets_from_secret_</w:t>
             </w:r>
             <w:proofErr w:type="gramStart"/>
             <w:r>
@@ -23344,15 +23272,7 @@
                 <w:sz w:val="18"/>
                 <w:szCs w:val="18"/>
               </w:rPr>
-              <w:t>manager</w:t>
-            </w:r>
-            <w:proofErr w:type="spellEnd"/>
-            <w:r>
-              <w:rPr>
-                <w:sz w:val="18"/>
-                <w:szCs w:val="18"/>
-              </w:rPr>
-              <w:t>(</w:t>
+              <w:t>manager(</w:t>
             </w:r>
             <w:proofErr w:type="gramEnd"/>
             <w:r>
@@ -23405,15 +23325,7 @@
                 <w:sz w:val="18"/>
                 <w:szCs w:val="18"/>
               </w:rPr>
-              <w:t xml:space="preserve">  - Drive download: added </w:t>
-            </w:r>
-            <w:proofErr w:type="spellStart"/>
-            <w:r>
-              <w:rPr>
-                <w:sz w:val="18"/>
-                <w:szCs w:val="18"/>
-              </w:rPr>
-              <w:t>download_latest_icf_file_from_</w:t>
+              <w:t xml:space="preserve">  - Drive download: added download_latest_icf_file_from_</w:t>
             </w:r>
             <w:proofErr w:type="gramStart"/>
             <w:r>
@@ -23421,15 +23333,7 @@
                 <w:sz w:val="18"/>
                 <w:szCs w:val="18"/>
               </w:rPr>
-              <w:t>drive</w:t>
-            </w:r>
-            <w:proofErr w:type="spellEnd"/>
-            <w:r>
-              <w:rPr>
-                <w:sz w:val="18"/>
-                <w:szCs w:val="18"/>
-              </w:rPr>
-              <w:t>(</w:t>
+              <w:t>drive(</w:t>
             </w:r>
             <w:proofErr w:type="gramEnd"/>
             <w:r>
@@ -23452,23 +23356,7 @@
                 <w:sz w:val="18"/>
                 <w:szCs w:val="18"/>
               </w:rPr>
-              <w:t xml:space="preserve">    local </w:t>
-            </w:r>
-            <w:proofErr w:type="spellStart"/>
-            <w:r>
-              <w:rPr>
-                <w:sz w:val="18"/>
-                <w:szCs w:val="18"/>
-              </w:rPr>
-              <w:t>activemembers</w:t>
-            </w:r>
-            <w:proofErr w:type="spellEnd"/>
-            <w:r>
-              <w:rPr>
-                <w:sz w:val="18"/>
-                <w:szCs w:val="18"/>
-              </w:rPr>
-              <w:t xml:space="preserve"> CSV is found, the script downloads the most recent</w:t>
+              <w:t xml:space="preserve">    local activemembers CSV is found, the script downloads the most recent</w:t>
             </w:r>
           </w:p>
           <w:p>
@@ -23560,7 +23448,6 @@
               </w:rPr>
               <w:t xml:space="preserve">  - DRIVE_SCOPES broadened from </w:t>
             </w:r>
-            <w:proofErr w:type="spellStart"/>
             <w:proofErr w:type="gramStart"/>
             <w:r>
               <w:rPr>
@@ -23569,7 +23456,6 @@
               </w:rPr>
               <w:t>drive.file</w:t>
             </w:r>
-            <w:proofErr w:type="spellEnd"/>
             <w:proofErr w:type="gramEnd"/>
             <w:r>
               <w:rPr>
@@ -23734,23 +23620,7 @@
                 <w:sz w:val="18"/>
                 <w:szCs w:val="18"/>
               </w:rPr>
-              <w:t xml:space="preserve">    reference the "ICF Global </w:t>
-            </w:r>
-            <w:proofErr w:type="spellStart"/>
-            <w:r>
-              <w:rPr>
-                <w:sz w:val="18"/>
-                <w:szCs w:val="18"/>
-              </w:rPr>
-              <w:t>GlueUp</w:t>
-            </w:r>
-            <w:proofErr w:type="spellEnd"/>
-            <w:r>
-              <w:rPr>
-                <w:sz w:val="18"/>
-                <w:szCs w:val="18"/>
-              </w:rPr>
-              <w:t xml:space="preserve"> Sync Operations" doc for full instructions.</w:t>
+              <w:t xml:space="preserve">    reference the "ICF Global GlueUp Sync Operations" doc for full instructions.</w:t>
             </w:r>
           </w:p>
         </w:tc>
@@ -23878,23 +23748,7 @@
                 <w:sz w:val="18"/>
                 <w:szCs w:val="18"/>
               </w:rPr>
-              <w:t xml:space="preserve">    for manual </w:t>
-            </w:r>
-            <w:proofErr w:type="spellStart"/>
-            <w:r>
-              <w:rPr>
-                <w:sz w:val="18"/>
-                <w:szCs w:val="18"/>
-              </w:rPr>
-              <w:t>GlueUp</w:t>
-            </w:r>
-            <w:proofErr w:type="spellEnd"/>
-            <w:r>
-              <w:rPr>
-                <w:sz w:val="18"/>
-                <w:szCs w:val="18"/>
-              </w:rPr>
-              <w:t xml:space="preserve"> UI update; CHANGED members (other fields only) get contact</w:t>
+              <w:t xml:space="preserve">    for manual GlueUp UI update; CHANGED members (other fields only) get contact</w:t>
             </w:r>
           </w:p>
           <w:p>
@@ -23924,23 +23778,7 @@
                 <w:sz w:val="18"/>
                 <w:szCs w:val="18"/>
               </w:rPr>
-              <w:t xml:space="preserve">  - Added dropped member detection: </w:t>
-            </w:r>
-            <w:proofErr w:type="spellStart"/>
-            <w:r>
-              <w:rPr>
-                <w:sz w:val="18"/>
-                <w:szCs w:val="18"/>
-              </w:rPr>
-              <w:t>GlueUp</w:t>
-            </w:r>
-            <w:proofErr w:type="spellEnd"/>
-            <w:r>
-              <w:rPr>
-                <w:sz w:val="18"/>
-                <w:szCs w:val="18"/>
-              </w:rPr>
-              <w:t xml:space="preserve"> records with an ICF Member ID not</w:t>
+              <w:t xml:space="preserve">  - Added dropped member detection: GlueUp records with an ICF Member ID not</w:t>
             </w:r>
           </w:p>
           <w:p>
@@ -23970,23 +23808,7 @@
                 <w:sz w:val="18"/>
                 <w:szCs w:val="18"/>
               </w:rPr>
-              <w:t xml:space="preserve">    for manual membership cancellation in </w:t>
-            </w:r>
-            <w:proofErr w:type="spellStart"/>
-            <w:r>
-              <w:rPr>
-                <w:sz w:val="18"/>
-                <w:szCs w:val="18"/>
-              </w:rPr>
-              <w:t>GlueUp</w:t>
-            </w:r>
-            <w:proofErr w:type="spellEnd"/>
-            <w:r>
-              <w:rPr>
-                <w:sz w:val="18"/>
-                <w:szCs w:val="18"/>
-              </w:rPr>
-              <w:t xml:space="preserve"> Admin UI.</w:t>
+              <w:t xml:space="preserve">    for manual membership cancellation in GlueUp Admin UI.</w:t>
             </w:r>
           </w:p>
           <w:p>
@@ -24031,17 +23853,8 @@
                 <w:sz w:val="18"/>
                 <w:szCs w:val="18"/>
               </w:rPr>
-              <w:t xml:space="preserve">  - New output file: dropped_members_*.xlsx — replaces the old </w:t>
-            </w:r>
-            <w:proofErr w:type="spellStart"/>
-            <w:r>
-              <w:rPr>
-                <w:sz w:val="18"/>
-                <w:szCs w:val="18"/>
-              </w:rPr>
-              <w:t>process_rows</w:t>
-            </w:r>
-            <w:proofErr w:type="spellEnd"/>
+              <w:t xml:space="preserve">  - New output file: dropped_members_*.xlsx — replaces the old process_rows</w:t>
+            </w:r>
           </w:p>
           <w:p>
             <w:pPr>
@@ -24055,23 +23868,7 @@
                 <w:sz w:val="18"/>
                 <w:szCs w:val="18"/>
               </w:rPr>
-              <w:t xml:space="preserve">    DROPPED logic; now generated directly from </w:t>
-            </w:r>
-            <w:proofErr w:type="spellStart"/>
-            <w:r>
-              <w:rPr>
-                <w:sz w:val="18"/>
-                <w:szCs w:val="18"/>
-              </w:rPr>
-              <w:t>GlueUp</w:t>
-            </w:r>
-            <w:proofErr w:type="spellEnd"/>
-            <w:r>
-              <w:rPr>
-                <w:sz w:val="18"/>
-                <w:szCs w:val="18"/>
-              </w:rPr>
-              <w:t xml:space="preserve"> index comparison.</w:t>
+              <w:t xml:space="preserve">    DROPPED logic; now generated directly from GlueUp index comparison.</w:t>
             </w:r>
           </w:p>
           <w:p>
@@ -24131,71 +23928,7 @@
                 <w:sz w:val="18"/>
                 <w:szCs w:val="18"/>
               </w:rPr>
-              <w:t xml:space="preserve">  - Removed: </w:t>
-            </w:r>
-            <w:proofErr w:type="spellStart"/>
-            <w:r>
-              <w:rPr>
-                <w:sz w:val="18"/>
-                <w:szCs w:val="18"/>
-              </w:rPr>
-              <w:t>is_active</w:t>
-            </w:r>
-            <w:proofErr w:type="spellEnd"/>
-            <w:r>
-              <w:rPr>
-                <w:sz w:val="18"/>
-                <w:szCs w:val="18"/>
-              </w:rPr>
-              <w:t xml:space="preserve">, </w:t>
-            </w:r>
-            <w:proofErr w:type="spellStart"/>
-            <w:r>
-              <w:rPr>
-                <w:sz w:val="18"/>
-                <w:szCs w:val="18"/>
-              </w:rPr>
-              <w:t>new_expired</w:t>
-            </w:r>
-            <w:proofErr w:type="spellEnd"/>
-            <w:r>
-              <w:rPr>
-                <w:sz w:val="18"/>
-                <w:szCs w:val="18"/>
-              </w:rPr>
-              <w:t xml:space="preserve">, </w:t>
-            </w:r>
-            <w:proofErr w:type="spellStart"/>
-            <w:r>
-              <w:rPr>
-                <w:sz w:val="18"/>
-                <w:szCs w:val="18"/>
-              </w:rPr>
-              <w:t>expiry_passed</w:t>
-            </w:r>
-            <w:proofErr w:type="spellEnd"/>
-            <w:r>
-              <w:rPr>
-                <w:sz w:val="18"/>
-                <w:szCs w:val="18"/>
-              </w:rPr>
-              <w:t xml:space="preserve">, </w:t>
-            </w:r>
-            <w:proofErr w:type="spellStart"/>
-            <w:r>
-              <w:rPr>
-                <w:sz w:val="18"/>
-                <w:szCs w:val="18"/>
-              </w:rPr>
-              <w:t>membership_triggered</w:t>
-            </w:r>
-            <w:proofErr w:type="spellEnd"/>
-            <w:r>
-              <w:rPr>
-                <w:sz w:val="18"/>
-                <w:szCs w:val="18"/>
-              </w:rPr>
-              <w:t xml:space="preserve"> logic.</w:t>
+              <w:t xml:space="preserve">  - Removed: is_active, new_expired, expiry_passed, membership_triggered logic.</w:t>
             </w:r>
           </w:p>
           <w:p>
@@ -24210,7 +23943,6 @@
                 <w:sz w:val="18"/>
                 <w:szCs w:val="18"/>
               </w:rPr>
-              <w:lastRenderedPageBreak/>
               <w:t xml:space="preserve">  - Notification email updated to reflect new 6-file output and action steps.</w:t>
             </w:r>
           </w:p>
@@ -24280,23 +24012,7 @@
                 <w:sz w:val="18"/>
                 <w:szCs w:val="18"/>
               </w:rPr>
-              <w:t xml:space="preserve">  - </w:t>
-            </w:r>
-            <w:proofErr w:type="spellStart"/>
-            <w:r>
-              <w:rPr>
-                <w:sz w:val="18"/>
-                <w:szCs w:val="18"/>
-              </w:rPr>
-              <w:t>build_membership_row</w:t>
-            </w:r>
-            <w:proofErr w:type="spellEnd"/>
-            <w:r>
-              <w:rPr>
-                <w:sz w:val="18"/>
-                <w:szCs w:val="18"/>
-              </w:rPr>
-              <w:t>: "Membership End Date" now set to 10 years from</w:t>
+              <w:t xml:space="preserve">  - build_membership_row: "Membership End Date" now set to 10 years from</w:t>
             </w:r>
           </w:p>
           <w:p>
@@ -24311,23 +24027,7 @@
                 <w:sz w:val="18"/>
                 <w:szCs w:val="18"/>
               </w:rPr>
-              <w:t xml:space="preserve">    run date (matching </w:t>
-            </w:r>
-            <w:proofErr w:type="spellStart"/>
-            <w:r>
-              <w:rPr>
-                <w:sz w:val="18"/>
-                <w:szCs w:val="18"/>
-              </w:rPr>
-              <w:t>GlueUp's</w:t>
-            </w:r>
-            <w:proofErr w:type="spellEnd"/>
-            <w:r>
-              <w:rPr>
-                <w:sz w:val="18"/>
-                <w:szCs w:val="18"/>
-              </w:rPr>
-              <w:t xml:space="preserve"> new 10-year membership term configuration)</w:t>
+              <w:t xml:space="preserve">    run date (matching GlueUp's new 10-year membership term configuration)</w:t>
             </w:r>
           </w:p>
           <w:p>
@@ -24358,6 +24058,331 @@
                 <w:szCs w:val="18"/>
               </w:rPr>
               <w:t xml:space="preserve">    continues to reflect the actual ICF expiry date.</w:t>
+            </w:r>
+          </w:p>
+        </w:tc>
+      </w:tr>
+      <w:tr>
+        <w:tc>
+          <w:tcPr>
+            <w:tcW w:w="1080" w:type="dxa"/>
+            <w:tcBorders>
+              <w:top w:val="single" w:sz="1" w:space="0" w:color="CCCCCC"/>
+              <w:left w:val="single" w:sz="1" w:space="0" w:color="CCCCCC"/>
+              <w:bottom w:val="single" w:sz="1" w:space="0" w:color="CCCCCC"/>
+              <w:right w:val="single" w:sz="1" w:space="0" w:color="CCCCCC"/>
+            </w:tcBorders>
+            <w:shd w:val="clear" w:color="auto" w:fill="FFFFFF"/>
+            <w:tcMar>
+              <w:top w:w="80" w:type="dxa"/>
+              <w:left w:w="120" w:type="dxa"/>
+              <w:bottom w:w="80" w:type="dxa"/>
+              <w:right w:w="120" w:type="dxa"/>
+            </w:tcMar>
+          </w:tcPr>
+          <w:p>
+            <w:pPr>
+              <w:rPr>
+                <w:sz w:val="18"/>
+                <w:szCs w:val="18"/>
+              </w:rPr>
+            </w:pPr>
+            <w:r>
+              <w:rPr>
+                <w:sz w:val="18"/>
+                <w:szCs w:val="18"/>
+              </w:rPr>
+              <w:t>2.2.0</w:t>
+            </w:r>
+          </w:p>
+        </w:tc>
+        <w:tc>
+          <w:tcPr>
+            <w:tcW w:w="8280" w:type="dxa"/>
+            <w:tcBorders>
+              <w:top w:val="single" w:sz="1" w:space="0" w:color="CCCCCC"/>
+              <w:left w:val="single" w:sz="1" w:space="0" w:color="CCCCCC"/>
+              <w:bottom w:val="single" w:sz="1" w:space="0" w:color="CCCCCC"/>
+              <w:right w:val="single" w:sz="1" w:space="0" w:color="CCCCCC"/>
+            </w:tcBorders>
+            <w:shd w:val="clear" w:color="auto" w:fill="FFFFFF"/>
+            <w:tcMar>
+              <w:top w:w="80" w:type="dxa"/>
+              <w:left w:w="120" w:type="dxa"/>
+              <w:bottom w:w="80" w:type="dxa"/>
+              <w:right w:w="120" w:type="dxa"/>
+            </w:tcMar>
+          </w:tcPr>
+          <w:p>
+            <w:pPr>
+              <w:rPr>
+                <w:sz w:val="18"/>
+                <w:szCs w:val="18"/>
+              </w:rPr>
+            </w:pPr>
+            <w:r>
+              <w:rPr>
+                <w:sz w:val="18"/>
+                <w:szCs w:val="18"/>
+              </w:rPr>
+              <w:t xml:space="preserve">  - GlueUp Contact Settings confirmed all ICF Global * custom fields,</w:t>
+            </w:r>
+          </w:p>
+          <w:p>
+            <w:pPr>
+              <w:rPr>
+                <w:sz w:val="18"/>
+                <w:szCs w:val="18"/>
+              </w:rPr>
+            </w:pPr>
+            <w:r>
+              <w:rPr>
+                <w:sz w:val="18"/>
+                <w:szCs w:val="18"/>
+              </w:rPr>
+              <w:t xml:space="preserve">    including "ICF Global Membership End Date", are Contact-scoped (GlueUp</w:t>
+            </w:r>
+          </w:p>
+          <w:p>
+            <w:pPr>
+              <w:rPr>
+                <w:sz w:val="18"/>
+                <w:szCs w:val="18"/>
+              </w:rPr>
+            </w:pPr>
+            <w:r>
+              <w:rPr>
+                <w:sz w:val="18"/>
+                <w:szCs w:val="18"/>
+              </w:rPr>
+              <w:t xml:space="preserve">    has no custom fields on the Membership object). Verified via live test</w:t>
+            </w:r>
+          </w:p>
+          <w:p>
+            <w:pPr>
+              <w:rPr>
+                <w:sz w:val="18"/>
+                <w:szCs w:val="18"/>
+              </w:rPr>
+            </w:pPr>
+            <w:r>
+              <w:rPr>
+                <w:sz w:val="18"/>
+                <w:szCs w:val="18"/>
+              </w:rPr>
+              <w:t xml:space="preserve">    import (Tommy Price, member 9066454) with no duplication and a correct</w:t>
+            </w:r>
+          </w:p>
+          <w:p>
+            <w:pPr>
+              <w:rPr>
+                <w:sz w:val="18"/>
+                <w:szCs w:val="18"/>
+              </w:rPr>
+            </w:pPr>
+            <w:r>
+              <w:rPr>
+                <w:sz w:val="18"/>
+                <w:szCs w:val="18"/>
+              </w:rPr>
+              <w:t xml:space="preserve">    field update.</w:t>
+            </w:r>
+          </w:p>
+          <w:p>
+            <w:pPr>
+              <w:rPr>
+                <w:sz w:val="18"/>
+                <w:szCs w:val="18"/>
+              </w:rPr>
+            </w:pPr>
+            <w:r>
+              <w:rPr>
+                <w:sz w:val="18"/>
+                <w:szCs w:val="18"/>
+              </w:rPr>
+              <w:t xml:space="preserve">  - RENEWAL status no longer generates a separate renewals_*.xlsx worklist</w:t>
+            </w:r>
+          </w:p>
+          <w:p>
+            <w:pPr>
+              <w:rPr>
+                <w:sz w:val="18"/>
+                <w:szCs w:val="18"/>
+              </w:rPr>
+            </w:pPr>
+            <w:r>
+              <w:rPr>
+                <w:sz w:val="18"/>
+                <w:szCs w:val="18"/>
+              </w:rPr>
+              <w:t xml:space="preserve">    or requires manual GlueUp Admin UI date edits. build_contact_</w:t>
+            </w:r>
+            <w:proofErr w:type="gramStart"/>
+            <w:r>
+              <w:rPr>
+                <w:sz w:val="18"/>
+                <w:szCs w:val="18"/>
+              </w:rPr>
+              <w:t>row(</w:t>
+            </w:r>
+            <w:proofErr w:type="gramEnd"/>
+            <w:r>
+              <w:rPr>
+                <w:sz w:val="18"/>
+                <w:szCs w:val="18"/>
+              </w:rPr>
+              <w:t>) now</w:t>
+            </w:r>
+          </w:p>
+          <w:p>
+            <w:pPr>
+              <w:rPr>
+                <w:sz w:val="18"/>
+                <w:szCs w:val="18"/>
+              </w:rPr>
+            </w:pPr>
+            <w:r>
+              <w:rPr>
+                <w:sz w:val="18"/>
+                <w:szCs w:val="18"/>
+              </w:rPr>
+              <w:t xml:space="preserve">    accepts is_renewal and populates "ICF Global Membership End Date"</w:t>
+            </w:r>
+          </w:p>
+          <w:p>
+            <w:pPr>
+              <w:rPr>
+                <w:sz w:val="18"/>
+                <w:szCs w:val="18"/>
+              </w:rPr>
+            </w:pPr>
+            <w:r>
+              <w:rPr>
+                <w:sz w:val="18"/>
+                <w:szCs w:val="18"/>
+              </w:rPr>
+              <w:t xml:space="preserve">    directly when True. Start Date / Restart Date / Type remain blank on</w:t>
+            </w:r>
+          </w:p>
+          <w:p>
+            <w:pPr>
+              <w:rPr>
+                <w:sz w:val="18"/>
+                <w:szCs w:val="18"/>
+              </w:rPr>
+            </w:pPr>
+            <w:r>
+              <w:rPr>
+                <w:sz w:val="18"/>
+                <w:szCs w:val="18"/>
+              </w:rPr>
+              <w:t xml:space="preserve">    renewal by design, to preserve legacy values in those fields.</w:t>
+            </w:r>
+          </w:p>
+          <w:p>
+            <w:pPr>
+              <w:rPr>
+                <w:sz w:val="18"/>
+                <w:szCs w:val="18"/>
+              </w:rPr>
+            </w:pPr>
+            <w:r>
+              <w:rPr>
+                <w:sz w:val="18"/>
+                <w:szCs w:val="18"/>
+              </w:rPr>
+              <w:t xml:space="preserve">  - process_</w:t>
+            </w:r>
+            <w:proofErr w:type="gramStart"/>
+            <w:r>
+              <w:rPr>
+                <w:sz w:val="18"/>
+                <w:szCs w:val="18"/>
+              </w:rPr>
+              <w:t>rows(</w:t>
+            </w:r>
+            <w:proofErr w:type="gramEnd"/>
+            <w:r>
+              <w:rPr>
+                <w:sz w:val="18"/>
+                <w:szCs w:val="18"/>
+              </w:rPr>
+              <w:t>) RENEWAL branch: contact import only (no membership</w:t>
+            </w:r>
+          </w:p>
+          <w:p>
+            <w:pPr>
+              <w:rPr>
+                <w:sz w:val="18"/>
+                <w:szCs w:val="18"/>
+              </w:rPr>
+            </w:pPr>
+            <w:r>
+              <w:rPr>
+                <w:sz w:val="18"/>
+                <w:szCs w:val="18"/>
+              </w:rPr>
+              <w:t xml:space="preserve">    import, no renewal_rows list). RENEWAL remains a distinct status in</w:t>
+            </w:r>
+          </w:p>
+          <w:p>
+            <w:pPr>
+              <w:rPr>
+                <w:sz w:val="18"/>
+                <w:szCs w:val="18"/>
+              </w:rPr>
+            </w:pPr>
+            <w:r>
+              <w:rPr>
+                <w:sz w:val="18"/>
+                <w:szCs w:val="18"/>
+              </w:rPr>
+              <w:t xml:space="preserve">    the comparison report and run log for visibility/audit trail.</w:t>
+            </w:r>
+          </w:p>
+          <w:p>
+            <w:pPr>
+              <w:rPr>
+                <w:sz w:val="18"/>
+                <w:szCs w:val="18"/>
+              </w:rPr>
+            </w:pPr>
+            <w:r>
+              <w:rPr>
+                <w:sz w:val="18"/>
+                <w:szCs w:val="18"/>
+              </w:rPr>
+              <w:t xml:space="preserve">  - Removed renewals_*.xlsx from output files, Drive upload list, and the</w:t>
+            </w:r>
+          </w:p>
+          <w:p>
+            <w:pPr>
+              <w:rPr>
+                <w:sz w:val="18"/>
+                <w:szCs w:val="18"/>
+              </w:rPr>
+            </w:pPr>
+            <w:r>
+              <w:rPr>
+                <w:sz w:val="18"/>
+                <w:szCs w:val="18"/>
+              </w:rPr>
+              <w:t xml:space="preserve">    import-ready notification email. Email step numbering and wording</w:t>
+            </w:r>
+          </w:p>
+          <w:p>
+            <w:pPr>
+              <w:rPr>
+                <w:sz w:val="18"/>
+                <w:szCs w:val="18"/>
+              </w:rPr>
+            </w:pPr>
+            <w:r>
+              <w:rPr>
+                <w:sz w:val="18"/>
+                <w:szCs w:val="18"/>
+              </w:rPr>
+              <w:t xml:space="preserve">    updated accordingly.</w:t>
             </w:r>
           </w:p>
         </w:tc>

</xml_diff>